<commit_message>
Add invoice edge case and performance tests
</commit_message>
<xml_diff>
--- a/saas_scripts/admin_tools/documentation/billing/🔮 Possible Next Actions.docx
+++ b/saas_scripts/admin_tools/documentation/billing/🔮 Possible Next Actions.docx
@@ -14,7 +14,6 @@
           <w:szCs w:val="36"/>
         </w:rPr>
       </w:pPr>
-      <w:bookmarkStart w:id="0" w:name="_GoBack"/>
       <w:r>
         <w:rPr>
           <w:rFonts w:ascii="Segoe UI Emoji" w:eastAsia="Times New Roman" w:hAnsi="Segoe UI Emoji" w:cs="Segoe UI Emoji"/>
@@ -1933,7 +1932,6 @@
         <w:t>(</w:t>
       </w:r>
       <w:proofErr w:type="spellStart"/>
-      <w:proofErr w:type="gramStart"/>
       <w:r>
         <w:rPr>
           <w:rStyle w:val="HTMLCode"/>
@@ -1941,7 +1939,6 @@
         <w:t>serializers.ModelSerializer</w:t>
       </w:r>
       <w:proofErr w:type="spellEnd"/>
-      <w:proofErr w:type="gramEnd"/>
       <w:r>
         <w:rPr>
           <w:rStyle w:val="HTMLCode"/>
@@ -2025,95 +2022,65 @@
         <w:rPr>
           <w:rStyle w:val="HTMLCode"/>
         </w:rPr>
-        <w:t>validate_due_</w:t>
-      </w:r>
-      <w:proofErr w:type="gramStart"/>
+        <w:t>validate_due_date</w:t>
+      </w:r>
+      <w:proofErr w:type="spellEnd"/>
       <w:r>
         <w:rPr>
           <w:rStyle w:val="HTMLCode"/>
         </w:rPr>
-        <w:t>date</w:t>
+        <w:t>(self, value):</w:t>
+      </w:r>
+    </w:p>
+    <w:p>
+      <w:pPr>
+        <w:pStyle w:val="HTMLPreformatted"/>
+        <w:rPr>
+          <w:rStyle w:val="HTMLCode"/>
+        </w:rPr>
+      </w:pPr>
+      <w:r>
+        <w:rPr>
+          <w:rStyle w:val="HTMLCode"/>
+        </w:rPr>
+        <w:t xml:space="preserve">        if value &lt;= </w:t>
+      </w:r>
+      <w:proofErr w:type="spellStart"/>
+      <w:r>
+        <w:rPr>
+          <w:rStyle w:val="HTMLCode"/>
+        </w:rPr>
+        <w:t>timezone.now</w:t>
       </w:r>
       <w:proofErr w:type="spellEnd"/>
       <w:r>
         <w:rPr>
           <w:rStyle w:val="HTMLCode"/>
         </w:rPr>
-        <w:t>(</w:t>
-      </w:r>
-      <w:proofErr w:type="gramEnd"/>
-      <w:r>
+        <w:t>().date():</w:t>
+      </w:r>
+    </w:p>
+    <w:p>
+      <w:pPr>
+        <w:pStyle w:val="HTMLPreformatted"/>
         <w:rPr>
           <w:rStyle w:val="HTMLCode"/>
         </w:rPr>
-        <w:t>self, value):</w:t>
-      </w:r>
-    </w:p>
-    <w:p>
-      <w:pPr>
-        <w:pStyle w:val="HTMLPreformatted"/>
+      </w:pPr>
+      <w:r>
         <w:rPr>
           <w:rStyle w:val="HTMLCode"/>
         </w:rPr>
-      </w:pPr>
+        <w:t xml:space="preserve">            raise </w:t>
+      </w:r>
+      <w:proofErr w:type="spellStart"/>
       <w:r>
         <w:rPr>
           <w:rStyle w:val="HTMLCode"/>
         </w:rPr>
-        <w:t xml:space="preserve">        if value &lt;= </w:t>
-      </w:r>
-      <w:proofErr w:type="spellStart"/>
-      <w:r>
-        <w:rPr>
-          <w:rStyle w:val="HTMLCode"/>
-        </w:rPr>
-        <w:t>timezone.now</w:t>
+        <w:t>serializers.ValidationError</w:t>
       </w:r>
       <w:proofErr w:type="spellEnd"/>
-      <w:r>
-        <w:rPr>
-          <w:rStyle w:val="HTMLCode"/>
-        </w:rPr>
-        <w:t>(</w:t>
-      </w:r>
-      <w:proofErr w:type="gramStart"/>
-      <w:r>
-        <w:rPr>
-          <w:rStyle w:val="HTMLCode"/>
-        </w:rPr>
-        <w:t>).date</w:t>
-      </w:r>
-      <w:proofErr w:type="gramEnd"/>
-      <w:r>
-        <w:rPr>
-          <w:rStyle w:val="HTMLCode"/>
-        </w:rPr>
-        <w:t>():</w:t>
-      </w:r>
-    </w:p>
-    <w:p>
-      <w:pPr>
-        <w:pStyle w:val="HTMLPreformatted"/>
-        <w:rPr>
-          <w:rStyle w:val="HTMLCode"/>
-        </w:rPr>
-      </w:pPr>
-      <w:r>
-        <w:rPr>
-          <w:rStyle w:val="HTMLCode"/>
-        </w:rPr>
-        <w:t xml:space="preserve">            raise </w:t>
-      </w:r>
-      <w:proofErr w:type="spellStart"/>
-      <w:proofErr w:type="gramStart"/>
-      <w:r>
-        <w:rPr>
-          <w:rStyle w:val="HTMLCode"/>
-        </w:rPr>
-        <w:t>serializers.ValidationError</w:t>
-      </w:r>
-      <w:proofErr w:type="spellEnd"/>
-      <w:proofErr w:type="gramEnd"/>
       <w:r>
         <w:rPr>
           <w:rStyle w:val="HTMLCode"/>
@@ -2529,23 +2496,13 @@
           <w:szCs w:val="24"/>
         </w:rPr>
       </w:pPr>
-      <w:proofErr w:type="gramStart"/>
-      <w:r>
-        <w:rPr>
-          <w:rFonts w:ascii="Times New Roman" w:eastAsia="Times New Roman" w:hAnsi="Times New Roman" w:cs="Times New Roman"/>
-          <w:sz w:val="24"/>
-          <w:szCs w:val="24"/>
-        </w:rPr>
-        <w:t>yes</w:t>
-      </w:r>
-      <w:proofErr w:type="gramEnd"/>
-      <w:r>
-        <w:rPr>
-          <w:rFonts w:ascii="Times New Roman" w:eastAsia="Times New Roman" w:hAnsi="Times New Roman" w:cs="Times New Roman"/>
-          <w:sz w:val="24"/>
-          <w:szCs w:val="24"/>
-        </w:rPr>
-        <w:t xml:space="preserve"> please but I will like you to elaborate implementing this project with CI/CD integration best practices.</w:t>
+      <w:r>
+        <w:rPr>
+          <w:rFonts w:ascii="Times New Roman" w:eastAsia="Times New Roman" w:hAnsi="Times New Roman" w:cs="Times New Roman"/>
+          <w:sz w:val="24"/>
+          <w:szCs w:val="24"/>
+        </w:rPr>
+        <w:t>yes please but I will like you to elaborate implementing this project with CI/CD integration best practices.</w:t>
       </w:r>
     </w:p>
     <w:p>
@@ -3898,18 +3855,8 @@
           <w:sz w:val="20"/>
           <w:szCs w:val="20"/>
         </w:rPr>
-        <w:t xml:space="preserve">    branches: [ "main", "develop</w:t>
-      </w:r>
-      <w:proofErr w:type="gramStart"/>
-      <w:r>
-        <w:rPr>
-          <w:rFonts w:ascii="Courier New" w:eastAsia="Times New Roman" w:hAnsi="Courier New" w:cs="Courier New"/>
-          <w:sz w:val="20"/>
-          <w:szCs w:val="20"/>
-        </w:rPr>
-        <w:t>" ]</w:t>
-      </w:r>
-      <w:proofErr w:type="gramEnd"/>
+        <w:t xml:space="preserve">    branches: [ "main", "develop" ]</w:t>
+      </w:r>
     </w:p>
     <w:p>
       <w:pPr>
@@ -3998,18 +3945,8 @@
           <w:sz w:val="20"/>
           <w:szCs w:val="20"/>
         </w:rPr>
-        <w:t xml:space="preserve">    branches: [ "main", "develop</w:t>
-      </w:r>
-      <w:proofErr w:type="gramStart"/>
-      <w:r>
-        <w:rPr>
-          <w:rFonts w:ascii="Courier New" w:eastAsia="Times New Roman" w:hAnsi="Courier New" w:cs="Courier New"/>
-          <w:sz w:val="20"/>
-          <w:szCs w:val="20"/>
-        </w:rPr>
-        <w:t>" ]</w:t>
-      </w:r>
-      <w:proofErr w:type="gramEnd"/>
+        <w:t xml:space="preserve">    branches: [ "main", "develop" ]</w:t>
+      </w:r>
     </w:p>
     <w:p>
       <w:pPr>
@@ -4576,18 +4513,8 @@
           <w:sz w:val="20"/>
           <w:szCs w:val="20"/>
         </w:rPr>
-        <w:t xml:space="preserve">          flake</w:t>
-      </w:r>
-      <w:proofErr w:type="gramStart"/>
-      <w:r>
-        <w:rPr>
-          <w:rFonts w:ascii="Courier New" w:eastAsia="Times New Roman" w:hAnsi="Courier New" w:cs="Courier New"/>
-          <w:sz w:val="20"/>
-          <w:szCs w:val="20"/>
-        </w:rPr>
-        <w:t>8 .</w:t>
-      </w:r>
-      <w:proofErr w:type="gramEnd"/>
+        <w:t xml:space="preserve">          flake8 .</w:t>
+      </w:r>
     </w:p>
     <w:p>
       <w:pPr>
@@ -4622,18 +4549,8 @@
           <w:sz w:val="20"/>
           <w:szCs w:val="20"/>
         </w:rPr>
-        <w:t xml:space="preserve">          black --</w:t>
-      </w:r>
-      <w:proofErr w:type="gramStart"/>
-      <w:r>
-        <w:rPr>
-          <w:rFonts w:ascii="Courier New" w:eastAsia="Times New Roman" w:hAnsi="Courier New" w:cs="Courier New"/>
-          <w:sz w:val="20"/>
-          <w:szCs w:val="20"/>
-        </w:rPr>
-        <w:t>check .</w:t>
-      </w:r>
-      <w:proofErr w:type="gramEnd"/>
+        <w:t xml:space="preserve">          black --check .</w:t>
+      </w:r>
     </w:p>
     <w:p>
       <w:pPr>
@@ -7014,18 +6931,8 @@
           <w:sz w:val="20"/>
           <w:szCs w:val="20"/>
         </w:rPr>
-        <w:t xml:space="preserve">        run: flake</w:t>
-      </w:r>
-      <w:proofErr w:type="gramStart"/>
-      <w:r>
-        <w:rPr>
-          <w:rFonts w:ascii="Courier New" w:eastAsia="Times New Roman" w:hAnsi="Courier New" w:cs="Courier New"/>
-          <w:sz w:val="20"/>
-          <w:szCs w:val="20"/>
-        </w:rPr>
-        <w:t>8 .</w:t>
-      </w:r>
-      <w:proofErr w:type="gramEnd"/>
+        <w:t xml:space="preserve">        run: flake8 .</w:t>
+      </w:r>
     </w:p>
     <w:p>
       <w:pPr>
@@ -10030,25 +9937,7 @@
           <w:sz w:val="20"/>
           <w:szCs w:val="20"/>
         </w:rPr>
-        <w:t xml:space="preserve">                │</w:t>
-      </w:r>
-      <w:proofErr w:type="gramStart"/>
-      <w:r>
-        <w:rPr>
-          <w:rFonts w:ascii="Courier New" w:eastAsia="Times New Roman" w:hAnsi="Courier New" w:cs="Courier New"/>
-          <w:sz w:val="20"/>
-          <w:szCs w:val="20"/>
-        </w:rPr>
-        <w:t xml:space="preserve">   (</w:t>
-      </w:r>
-      <w:proofErr w:type="gramEnd"/>
-      <w:r>
-        <w:rPr>
-          <w:rFonts w:ascii="Courier New" w:eastAsia="Times New Roman" w:hAnsi="Courier New" w:cs="Courier New"/>
-          <w:sz w:val="20"/>
-          <w:szCs w:val="20"/>
-        </w:rPr>
-        <w:t>commit / pull request)  │</w:t>
+        <w:t xml:space="preserve">                │   (commit / pull request)  │</w:t>
       </w:r>
     </w:p>
     <w:p>
@@ -10264,25 +10153,7 @@
           <w:sz w:val="20"/>
           <w:szCs w:val="20"/>
         </w:rPr>
-        <w:t xml:space="preserve">                </w:t>
-      </w:r>
-      <w:proofErr w:type="gramStart"/>
-      <w:r>
-        <w:rPr>
-          <w:rFonts w:ascii="Courier New" w:eastAsia="Times New Roman" w:hAnsi="Courier New" w:cs="Courier New"/>
-          <w:sz w:val="20"/>
-          <w:szCs w:val="20"/>
-        </w:rPr>
-        <w:t>│  1</w:t>
-      </w:r>
-      <w:proofErr w:type="gramEnd"/>
-      <w:r>
-        <w:rPr>
-          <w:rFonts w:ascii="Courier New" w:eastAsia="Times New Roman" w:hAnsi="Courier New" w:cs="Courier New"/>
-          <w:sz w:val="20"/>
-          <w:szCs w:val="20"/>
-        </w:rPr>
-        <w:t>. Checkout code          │</w:t>
+        <w:t xml:space="preserve">                │  1. Checkout code          │</w:t>
       </w:r>
     </w:p>
     <w:p>
@@ -10318,25 +10189,7 @@
           <w:sz w:val="20"/>
           <w:szCs w:val="20"/>
         </w:rPr>
-        <w:t xml:space="preserve">                </w:t>
-      </w:r>
-      <w:proofErr w:type="gramStart"/>
-      <w:r>
-        <w:rPr>
-          <w:rFonts w:ascii="Courier New" w:eastAsia="Times New Roman" w:hAnsi="Courier New" w:cs="Courier New"/>
-          <w:sz w:val="20"/>
-          <w:szCs w:val="20"/>
-        </w:rPr>
-        <w:t>│  2</w:t>
-      </w:r>
-      <w:proofErr w:type="gramEnd"/>
-      <w:r>
-        <w:rPr>
-          <w:rFonts w:ascii="Courier New" w:eastAsia="Times New Roman" w:hAnsi="Courier New" w:cs="Courier New"/>
-          <w:sz w:val="20"/>
-          <w:szCs w:val="20"/>
-        </w:rPr>
-        <w:t>. Setup Python env       │</w:t>
+        <w:t xml:space="preserve">                │  2. Setup Python env       │</w:t>
       </w:r>
     </w:p>
     <w:p>
@@ -10372,25 +10225,7 @@
           <w:sz w:val="20"/>
           <w:szCs w:val="20"/>
         </w:rPr>
-        <w:t xml:space="preserve">                </w:t>
-      </w:r>
-      <w:proofErr w:type="gramStart"/>
-      <w:r>
-        <w:rPr>
-          <w:rFonts w:ascii="Courier New" w:eastAsia="Times New Roman" w:hAnsi="Courier New" w:cs="Courier New"/>
-          <w:sz w:val="20"/>
-          <w:szCs w:val="20"/>
-        </w:rPr>
-        <w:t>│  3</w:t>
-      </w:r>
-      <w:proofErr w:type="gramEnd"/>
-      <w:r>
-        <w:rPr>
-          <w:rFonts w:ascii="Courier New" w:eastAsia="Times New Roman" w:hAnsi="Courier New" w:cs="Courier New"/>
-          <w:sz w:val="20"/>
-          <w:szCs w:val="20"/>
-        </w:rPr>
-        <w:t>. Install dependencies   │</w:t>
+        <w:t xml:space="preserve">                │  3. Install dependencies   │</w:t>
       </w:r>
     </w:p>
     <w:p>
@@ -10606,25 +10441,7 @@
           <w:sz w:val="20"/>
           <w:szCs w:val="20"/>
         </w:rPr>
-        <w:t xml:space="preserve">                </w:t>
-      </w:r>
-      <w:proofErr w:type="gramStart"/>
-      <w:r>
-        <w:rPr>
-          <w:rFonts w:ascii="Courier New" w:eastAsia="Times New Roman" w:hAnsi="Courier New" w:cs="Courier New"/>
-          <w:sz w:val="20"/>
-          <w:szCs w:val="20"/>
-        </w:rPr>
-        <w:t>│  -</w:t>
-      </w:r>
-      <w:proofErr w:type="gramEnd"/>
-      <w:r>
-        <w:rPr>
-          <w:rFonts w:ascii="Courier New" w:eastAsia="Times New Roman" w:hAnsi="Courier New" w:cs="Courier New"/>
-          <w:sz w:val="20"/>
-          <w:szCs w:val="20"/>
-        </w:rPr>
-        <w:t xml:space="preserve"> Linting (flake8, black) │</w:t>
+        <w:t xml:space="preserve">                │  - Linting (flake8, black) │</w:t>
       </w:r>
     </w:p>
     <w:p>
@@ -10660,25 +10477,7 @@
           <w:sz w:val="20"/>
           <w:szCs w:val="20"/>
         </w:rPr>
-        <w:t xml:space="preserve">                </w:t>
-      </w:r>
-      <w:proofErr w:type="gramStart"/>
-      <w:r>
-        <w:rPr>
-          <w:rFonts w:ascii="Courier New" w:eastAsia="Times New Roman" w:hAnsi="Courier New" w:cs="Courier New"/>
-          <w:sz w:val="20"/>
-          <w:szCs w:val="20"/>
-        </w:rPr>
-        <w:t>│  -</w:t>
-      </w:r>
-      <w:proofErr w:type="gramEnd"/>
-      <w:r>
-        <w:rPr>
-          <w:rFonts w:ascii="Courier New" w:eastAsia="Times New Roman" w:hAnsi="Courier New" w:cs="Courier New"/>
-          <w:sz w:val="20"/>
-          <w:szCs w:val="20"/>
-        </w:rPr>
-        <w:t xml:space="preserve"> Security checks (bandit)│</w:t>
+        <w:t xml:space="preserve">                │  - Security checks (bandit)│</w:t>
       </w:r>
     </w:p>
     <w:p>
@@ -10714,25 +10513,7 @@
           <w:sz w:val="20"/>
           <w:szCs w:val="20"/>
         </w:rPr>
-        <w:t xml:space="preserve">                </w:t>
-      </w:r>
-      <w:proofErr w:type="gramStart"/>
-      <w:r>
-        <w:rPr>
-          <w:rFonts w:ascii="Courier New" w:eastAsia="Times New Roman" w:hAnsi="Courier New" w:cs="Courier New"/>
-          <w:sz w:val="20"/>
-          <w:szCs w:val="20"/>
-        </w:rPr>
-        <w:t>│  -</w:t>
-      </w:r>
-      <w:proofErr w:type="gramEnd"/>
-      <w:r>
-        <w:rPr>
-          <w:rFonts w:ascii="Courier New" w:eastAsia="Times New Roman" w:hAnsi="Courier New" w:cs="Courier New"/>
-          <w:sz w:val="20"/>
-          <w:szCs w:val="20"/>
-        </w:rPr>
-        <w:t xml:space="preserve"> Migration check         │</w:t>
+        <w:t xml:space="preserve">                │  - Migration check         │</w:t>
       </w:r>
     </w:p>
     <w:p>
@@ -10948,25 +10729,7 @@
           <w:sz w:val="20"/>
           <w:szCs w:val="20"/>
         </w:rPr>
-        <w:t xml:space="preserve">                </w:t>
-      </w:r>
-      <w:proofErr w:type="gramStart"/>
-      <w:r>
-        <w:rPr>
-          <w:rFonts w:ascii="Courier New" w:eastAsia="Times New Roman" w:hAnsi="Courier New" w:cs="Courier New"/>
-          <w:sz w:val="20"/>
-          <w:szCs w:val="20"/>
-        </w:rPr>
-        <w:t>│  -</w:t>
-      </w:r>
-      <w:proofErr w:type="gramEnd"/>
-      <w:r>
-        <w:rPr>
-          <w:rFonts w:ascii="Courier New" w:eastAsia="Times New Roman" w:hAnsi="Courier New" w:cs="Courier New"/>
-          <w:sz w:val="20"/>
-          <w:szCs w:val="20"/>
-        </w:rPr>
-        <w:t xml:space="preserve"> Core RBAC tests         │</w:t>
+        <w:t xml:space="preserve">                │  - Core RBAC tests         │</w:t>
       </w:r>
     </w:p>
     <w:p>
@@ -11002,25 +10765,7 @@
           <w:sz w:val="20"/>
           <w:szCs w:val="20"/>
         </w:rPr>
-        <w:t xml:space="preserve">                │ </w:t>
-      </w:r>
-      <w:proofErr w:type="gramStart"/>
-      <w:r>
-        <w:rPr>
-          <w:rFonts w:ascii="Courier New" w:eastAsia="Times New Roman" w:hAnsi="Courier New" w:cs="Courier New"/>
-          <w:sz w:val="20"/>
-          <w:szCs w:val="20"/>
-        </w:rPr>
-        <w:t xml:space="preserve">   (</w:t>
-      </w:r>
-      <w:proofErr w:type="gramEnd"/>
-      <w:r>
-        <w:rPr>
-          <w:rFonts w:ascii="Courier New" w:eastAsia="Times New Roman" w:hAnsi="Courier New" w:cs="Courier New"/>
-          <w:sz w:val="20"/>
-          <w:szCs w:val="20"/>
-        </w:rPr>
-        <w:t>Tenant + Platform)     │</w:t>
+        <w:t xml:space="preserve">                │    (Tenant + Platform)     │</w:t>
       </w:r>
     </w:p>
     <w:p>
@@ -11056,25 +10801,7 @@
           <w:sz w:val="20"/>
           <w:szCs w:val="20"/>
         </w:rPr>
-        <w:t xml:space="preserve">                </w:t>
-      </w:r>
-      <w:proofErr w:type="gramStart"/>
-      <w:r>
-        <w:rPr>
-          <w:rFonts w:ascii="Courier New" w:eastAsia="Times New Roman" w:hAnsi="Courier New" w:cs="Courier New"/>
-          <w:sz w:val="20"/>
-          <w:szCs w:val="20"/>
-        </w:rPr>
-        <w:t>│  -</w:t>
-      </w:r>
-      <w:proofErr w:type="gramEnd"/>
-      <w:r>
-        <w:rPr>
-          <w:rFonts w:ascii="Courier New" w:eastAsia="Times New Roman" w:hAnsi="Courier New" w:cs="Courier New"/>
-          <w:sz w:val="20"/>
-          <w:szCs w:val="20"/>
-        </w:rPr>
-        <w:t xml:space="preserve"> Payments tests          │</w:t>
+        <w:t xml:space="preserve">                │  - Payments tests          │</w:t>
       </w:r>
     </w:p>
     <w:p>
@@ -11110,25 +10837,7 @@
           <w:sz w:val="20"/>
           <w:szCs w:val="20"/>
         </w:rPr>
-        <w:t xml:space="preserve">                </w:t>
-      </w:r>
-      <w:proofErr w:type="gramStart"/>
-      <w:r>
-        <w:rPr>
-          <w:rFonts w:ascii="Courier New" w:eastAsia="Times New Roman" w:hAnsi="Courier New" w:cs="Courier New"/>
-          <w:sz w:val="20"/>
-          <w:szCs w:val="20"/>
-        </w:rPr>
-        <w:t>│  -</w:t>
-      </w:r>
-      <w:proofErr w:type="gramEnd"/>
-      <w:r>
-        <w:rPr>
-          <w:rFonts w:ascii="Courier New" w:eastAsia="Times New Roman" w:hAnsi="Courier New" w:cs="Courier New"/>
-          <w:sz w:val="20"/>
-          <w:szCs w:val="20"/>
-        </w:rPr>
-        <w:t xml:space="preserve"> Inventory tests         │</w:t>
+        <w:t xml:space="preserve">                │  - Inventory tests         │</w:t>
       </w:r>
     </w:p>
     <w:p>
@@ -11164,25 +10873,7 @@
           <w:sz w:val="20"/>
           <w:szCs w:val="20"/>
         </w:rPr>
-        <w:t xml:space="preserve">                </w:t>
-      </w:r>
-      <w:proofErr w:type="gramStart"/>
-      <w:r>
-        <w:rPr>
-          <w:rFonts w:ascii="Courier New" w:eastAsia="Times New Roman" w:hAnsi="Courier New" w:cs="Courier New"/>
-          <w:sz w:val="20"/>
-          <w:szCs w:val="20"/>
-        </w:rPr>
-        <w:t>│  -</w:t>
-      </w:r>
-      <w:proofErr w:type="gramEnd"/>
-      <w:r>
-        <w:rPr>
-          <w:rFonts w:ascii="Courier New" w:eastAsia="Times New Roman" w:hAnsi="Courier New" w:cs="Courier New"/>
-          <w:sz w:val="20"/>
-          <w:szCs w:val="20"/>
-        </w:rPr>
-        <w:t xml:space="preserve"> CRM tests               │</w:t>
+        <w:t xml:space="preserve">                │  - CRM tests               │</w:t>
       </w:r>
     </w:p>
     <w:p>
@@ -11218,25 +10909,7 @@
           <w:sz w:val="20"/>
           <w:szCs w:val="20"/>
         </w:rPr>
-        <w:t xml:space="preserve">                </w:t>
-      </w:r>
-      <w:proofErr w:type="gramStart"/>
-      <w:r>
-        <w:rPr>
-          <w:rFonts w:ascii="Courier New" w:eastAsia="Times New Roman" w:hAnsi="Courier New" w:cs="Courier New"/>
-          <w:sz w:val="20"/>
-          <w:szCs w:val="20"/>
-        </w:rPr>
-        <w:t>│  -</w:t>
-      </w:r>
-      <w:proofErr w:type="gramEnd"/>
-      <w:r>
-        <w:rPr>
-          <w:rFonts w:ascii="Courier New" w:eastAsia="Times New Roman" w:hAnsi="Courier New" w:cs="Courier New"/>
-          <w:sz w:val="20"/>
-          <w:szCs w:val="20"/>
-        </w:rPr>
-        <w:t xml:space="preserve"> Coverage reports        │</w:t>
+        <w:t xml:space="preserve">                │  - Coverage reports        │</w:t>
       </w:r>
     </w:p>
     <w:p>
@@ -11453,25 +11126,7 @@
           <w:sz w:val="20"/>
           <w:szCs w:val="20"/>
         </w:rPr>
-        <w:t xml:space="preserve">                </w:t>
-      </w:r>
-      <w:proofErr w:type="gramStart"/>
-      <w:r>
-        <w:rPr>
-          <w:rFonts w:ascii="Courier New" w:eastAsia="Times New Roman" w:hAnsi="Courier New" w:cs="Courier New"/>
-          <w:sz w:val="20"/>
-          <w:szCs w:val="20"/>
-        </w:rPr>
-        <w:t>│  -</w:t>
-      </w:r>
-      <w:proofErr w:type="gramEnd"/>
-      <w:r>
-        <w:rPr>
-          <w:rFonts w:ascii="Courier New" w:eastAsia="Times New Roman" w:hAnsi="Courier New" w:cs="Courier New"/>
-          <w:sz w:val="20"/>
-          <w:szCs w:val="20"/>
-        </w:rPr>
-        <w:t xml:space="preserve"> Build Docker image      │</w:t>
+        <w:t xml:space="preserve">                │  - Build Docker image      │</w:t>
       </w:r>
     </w:p>
     <w:p>
@@ -11507,25 +11162,7 @@
           <w:sz w:val="20"/>
           <w:szCs w:val="20"/>
         </w:rPr>
-        <w:t xml:space="preserve">                </w:t>
-      </w:r>
-      <w:proofErr w:type="gramStart"/>
-      <w:r>
-        <w:rPr>
-          <w:rFonts w:ascii="Courier New" w:eastAsia="Times New Roman" w:hAnsi="Courier New" w:cs="Courier New"/>
-          <w:sz w:val="20"/>
-          <w:szCs w:val="20"/>
-        </w:rPr>
-        <w:t>│  -</w:t>
-      </w:r>
-      <w:proofErr w:type="gramEnd"/>
-      <w:r>
-        <w:rPr>
-          <w:rFonts w:ascii="Courier New" w:eastAsia="Times New Roman" w:hAnsi="Courier New" w:cs="Courier New"/>
-          <w:sz w:val="20"/>
-          <w:szCs w:val="20"/>
-        </w:rPr>
-        <w:t xml:space="preserve"> Tag with commit hash    │</w:t>
+        <w:t xml:space="preserve">                │  - Tag with commit hash    │</w:t>
       </w:r>
     </w:p>
     <w:p>
@@ -11561,25 +11198,7 @@
           <w:sz w:val="20"/>
           <w:szCs w:val="20"/>
         </w:rPr>
-        <w:t xml:space="preserve">                </w:t>
-      </w:r>
-      <w:proofErr w:type="gramStart"/>
-      <w:r>
-        <w:rPr>
-          <w:rFonts w:ascii="Courier New" w:eastAsia="Times New Roman" w:hAnsi="Courier New" w:cs="Courier New"/>
-          <w:sz w:val="20"/>
-          <w:szCs w:val="20"/>
-        </w:rPr>
-        <w:t>│  -</w:t>
-      </w:r>
-      <w:proofErr w:type="gramEnd"/>
-      <w:r>
-        <w:rPr>
-          <w:rFonts w:ascii="Courier New" w:eastAsia="Times New Roman" w:hAnsi="Courier New" w:cs="Courier New"/>
-          <w:sz w:val="20"/>
-          <w:szCs w:val="20"/>
-        </w:rPr>
-        <w:t xml:space="preserve"> Push to registry        │</w:t>
+        <w:t xml:space="preserve">                │  - Push to registry        │</w:t>
       </w:r>
     </w:p>
     <w:p>
@@ -11795,25 +11414,7 @@
           <w:sz w:val="20"/>
           <w:szCs w:val="20"/>
         </w:rPr>
-        <w:t xml:space="preserve">                </w:t>
-      </w:r>
-      <w:proofErr w:type="gramStart"/>
-      <w:r>
-        <w:rPr>
-          <w:rFonts w:ascii="Courier New" w:eastAsia="Times New Roman" w:hAnsi="Courier New" w:cs="Courier New"/>
-          <w:sz w:val="20"/>
-          <w:szCs w:val="20"/>
-        </w:rPr>
-        <w:t>│  -</w:t>
-      </w:r>
-      <w:proofErr w:type="gramEnd"/>
-      <w:r>
-        <w:rPr>
-          <w:rFonts w:ascii="Courier New" w:eastAsia="Times New Roman" w:hAnsi="Courier New" w:cs="Courier New"/>
-          <w:sz w:val="20"/>
-          <w:szCs w:val="20"/>
-        </w:rPr>
-        <w:t xml:space="preserve"> Apply migrations        │</w:t>
+        <w:t xml:space="preserve">                │  - Apply migrations        │</w:t>
       </w:r>
     </w:p>
     <w:p>
@@ -11849,25 +11450,7 @@
           <w:sz w:val="20"/>
           <w:szCs w:val="20"/>
         </w:rPr>
-        <w:t xml:space="preserve">                </w:t>
-      </w:r>
-      <w:proofErr w:type="gramStart"/>
-      <w:r>
-        <w:rPr>
-          <w:rFonts w:ascii="Courier New" w:eastAsia="Times New Roman" w:hAnsi="Courier New" w:cs="Courier New"/>
-          <w:sz w:val="20"/>
-          <w:szCs w:val="20"/>
-        </w:rPr>
-        <w:t>│  -</w:t>
-      </w:r>
-      <w:proofErr w:type="gramEnd"/>
-      <w:r>
-        <w:rPr>
-          <w:rFonts w:ascii="Courier New" w:eastAsia="Times New Roman" w:hAnsi="Courier New" w:cs="Courier New"/>
-          <w:sz w:val="20"/>
-          <w:szCs w:val="20"/>
-        </w:rPr>
-        <w:t xml:space="preserve"> Seed demo data          │</w:t>
+        <w:t xml:space="preserve">                │  - Seed demo data          │</w:t>
       </w:r>
     </w:p>
     <w:p>
@@ -11903,25 +11486,7 @@
           <w:sz w:val="20"/>
           <w:szCs w:val="20"/>
         </w:rPr>
-        <w:t xml:space="preserve">                │ </w:t>
-      </w:r>
-      <w:proofErr w:type="gramStart"/>
-      <w:r>
-        <w:rPr>
-          <w:rFonts w:ascii="Courier New" w:eastAsia="Times New Roman" w:hAnsi="Courier New" w:cs="Courier New"/>
-          <w:sz w:val="20"/>
-          <w:szCs w:val="20"/>
-        </w:rPr>
-        <w:t xml:space="preserve">   (</w:t>
-      </w:r>
-      <w:proofErr w:type="gramEnd"/>
-      <w:r>
-        <w:rPr>
-          <w:rFonts w:ascii="Courier New" w:eastAsia="Times New Roman" w:hAnsi="Courier New" w:cs="Courier New"/>
-          <w:sz w:val="20"/>
-          <w:szCs w:val="20"/>
-        </w:rPr>
-        <w:t>Invoices, Payments,    │</w:t>
+        <w:t xml:space="preserve">                │    (Invoices, Payments,    │</w:t>
       </w:r>
     </w:p>
     <w:p>
@@ -11957,25 +11522,7 @@
           <w:sz w:val="20"/>
           <w:szCs w:val="20"/>
         </w:rPr>
-        <w:t xml:space="preserve">                │     Inventory, </w:t>
-      </w:r>
-      <w:proofErr w:type="gramStart"/>
-      <w:r>
-        <w:rPr>
-          <w:rFonts w:ascii="Courier New" w:eastAsia="Times New Roman" w:hAnsi="Courier New" w:cs="Courier New"/>
-          <w:sz w:val="20"/>
-          <w:szCs w:val="20"/>
-        </w:rPr>
-        <w:t xml:space="preserve">CRM)   </w:t>
-      </w:r>
-      <w:proofErr w:type="gramEnd"/>
-      <w:r>
-        <w:rPr>
-          <w:rFonts w:ascii="Courier New" w:eastAsia="Times New Roman" w:hAnsi="Courier New" w:cs="Courier New"/>
-          <w:sz w:val="20"/>
-          <w:szCs w:val="20"/>
-        </w:rPr>
-        <w:t xml:space="preserve">     │</w:t>
+        <w:t xml:space="preserve">                │     Inventory, CRM)        │</w:t>
       </w:r>
     </w:p>
     <w:p>
@@ -12011,25 +11558,7 @@
           <w:sz w:val="20"/>
           <w:szCs w:val="20"/>
         </w:rPr>
-        <w:t xml:space="preserve">                </w:t>
-      </w:r>
-      <w:proofErr w:type="gramStart"/>
-      <w:r>
-        <w:rPr>
-          <w:rFonts w:ascii="Courier New" w:eastAsia="Times New Roman" w:hAnsi="Courier New" w:cs="Courier New"/>
-          <w:sz w:val="20"/>
-          <w:szCs w:val="20"/>
-        </w:rPr>
-        <w:t>│  -</w:t>
-      </w:r>
-      <w:proofErr w:type="gramEnd"/>
-      <w:r>
-        <w:rPr>
-          <w:rFonts w:ascii="Courier New" w:eastAsia="Times New Roman" w:hAnsi="Courier New" w:cs="Courier New"/>
-          <w:sz w:val="20"/>
-          <w:szCs w:val="20"/>
-        </w:rPr>
-        <w:t xml:space="preserve"> Run smoke tests         │</w:t>
+        <w:t xml:space="preserve">                │  - Run smoke tests         │</w:t>
       </w:r>
     </w:p>
     <w:p>
@@ -12245,25 +11774,7 @@
           <w:sz w:val="20"/>
           <w:szCs w:val="20"/>
         </w:rPr>
-        <w:t xml:space="preserve">                </w:t>
-      </w:r>
-      <w:proofErr w:type="gramStart"/>
-      <w:r>
-        <w:rPr>
-          <w:rFonts w:ascii="Courier New" w:eastAsia="Times New Roman" w:hAnsi="Courier New" w:cs="Courier New"/>
-          <w:sz w:val="20"/>
-          <w:szCs w:val="20"/>
-        </w:rPr>
-        <w:t>│  -</w:t>
-      </w:r>
-      <w:proofErr w:type="gramEnd"/>
-      <w:r>
-        <w:rPr>
-          <w:rFonts w:ascii="Courier New" w:eastAsia="Times New Roman" w:hAnsi="Courier New" w:cs="Courier New"/>
-          <w:sz w:val="20"/>
-          <w:szCs w:val="20"/>
-        </w:rPr>
-        <w:t xml:space="preserve"> Manual approval or      │</w:t>
+        <w:t xml:space="preserve">                │  - Manual approval or      │</w:t>
       </w:r>
     </w:p>
     <w:p>
@@ -12515,25 +12026,7 @@
           <w:sz w:val="20"/>
           <w:szCs w:val="20"/>
         </w:rPr>
-        <w:t xml:space="preserve">                </w:t>
-      </w:r>
-      <w:proofErr w:type="gramStart"/>
-      <w:r>
-        <w:rPr>
-          <w:rFonts w:ascii="Courier New" w:eastAsia="Times New Roman" w:hAnsi="Courier New" w:cs="Courier New"/>
-          <w:sz w:val="20"/>
-          <w:szCs w:val="20"/>
-        </w:rPr>
-        <w:t>│  -</w:t>
-      </w:r>
-      <w:proofErr w:type="gramEnd"/>
-      <w:r>
-        <w:rPr>
-          <w:rFonts w:ascii="Courier New" w:eastAsia="Times New Roman" w:hAnsi="Courier New" w:cs="Courier New"/>
-          <w:sz w:val="20"/>
-          <w:szCs w:val="20"/>
-        </w:rPr>
-        <w:t xml:space="preserve"> Blue/Green or Canary    │</w:t>
+        <w:t xml:space="preserve">                │  - Blue/Green or Canary    │</w:t>
       </w:r>
     </w:p>
     <w:p>
@@ -12569,25 +12062,7 @@
           <w:sz w:val="20"/>
           <w:szCs w:val="20"/>
         </w:rPr>
-        <w:t xml:space="preserve">                </w:t>
-      </w:r>
-      <w:proofErr w:type="gramStart"/>
-      <w:r>
-        <w:rPr>
-          <w:rFonts w:ascii="Courier New" w:eastAsia="Times New Roman" w:hAnsi="Courier New" w:cs="Courier New"/>
-          <w:sz w:val="20"/>
-          <w:szCs w:val="20"/>
-        </w:rPr>
-        <w:t>│  -</w:t>
-      </w:r>
-      <w:proofErr w:type="gramEnd"/>
-      <w:r>
-        <w:rPr>
-          <w:rFonts w:ascii="Courier New" w:eastAsia="Times New Roman" w:hAnsi="Courier New" w:cs="Courier New"/>
-          <w:sz w:val="20"/>
-          <w:szCs w:val="20"/>
-        </w:rPr>
-        <w:t xml:space="preserve"> Monitoring &amp; Alerts     │</w:t>
+        <w:t xml:space="preserve">                │  - Monitoring &amp; Alerts     │</w:t>
       </w:r>
     </w:p>
     <w:p>
@@ -12623,25 +12098,7 @@
           <w:sz w:val="20"/>
           <w:szCs w:val="20"/>
         </w:rPr>
-        <w:t xml:space="preserve">                </w:t>
-      </w:r>
-      <w:proofErr w:type="gramStart"/>
-      <w:r>
-        <w:rPr>
-          <w:rFonts w:ascii="Courier New" w:eastAsia="Times New Roman" w:hAnsi="Courier New" w:cs="Courier New"/>
-          <w:sz w:val="20"/>
-          <w:szCs w:val="20"/>
-        </w:rPr>
-        <w:t>│  -</w:t>
-      </w:r>
-      <w:proofErr w:type="gramEnd"/>
-      <w:r>
-        <w:rPr>
-          <w:rFonts w:ascii="Courier New" w:eastAsia="Times New Roman" w:hAnsi="Courier New" w:cs="Courier New"/>
-          <w:sz w:val="20"/>
-          <w:szCs w:val="20"/>
-        </w:rPr>
-        <w:t xml:space="preserve"> Rollback if needed      │</w:t>
+        <w:t xml:space="preserve">                │  - Rollback if needed      │</w:t>
       </w:r>
     </w:p>
     <w:p>
@@ -13125,23 +12582,13 @@
           <w:szCs w:val="24"/>
         </w:rPr>
       </w:pPr>
-      <w:proofErr w:type="gramStart"/>
-      <w:r>
-        <w:rPr>
-          <w:rFonts w:ascii="Times New Roman" w:eastAsia="Times New Roman" w:hAnsi="Times New Roman" w:cs="Times New Roman"/>
-          <w:sz w:val="24"/>
-          <w:szCs w:val="24"/>
-        </w:rPr>
-        <w:t>[ ]</w:t>
-      </w:r>
-      <w:proofErr w:type="gramEnd"/>
-      <w:r>
-        <w:rPr>
-          <w:rFonts w:ascii="Times New Roman" w:eastAsia="Times New Roman" w:hAnsi="Times New Roman" w:cs="Times New Roman"/>
-          <w:sz w:val="24"/>
-          <w:szCs w:val="24"/>
-        </w:rPr>
-        <w:t xml:space="preserve"> Unit tests for CRUD + RBAC (Owner explicit, others parametric).</w:t>
+      <w:r>
+        <w:rPr>
+          <w:rFonts w:ascii="Times New Roman" w:eastAsia="Times New Roman" w:hAnsi="Times New Roman" w:cs="Times New Roman"/>
+          <w:sz w:val="24"/>
+          <w:szCs w:val="24"/>
+        </w:rPr>
+        <w:t>[ ] Unit tests for CRUD + RBAC (Owner explicit, others parametric).</w:t>
       </w:r>
     </w:p>
     <w:p>
@@ -13157,23 +12604,13 @@
           <w:szCs w:val="24"/>
         </w:rPr>
       </w:pPr>
-      <w:proofErr w:type="gramStart"/>
-      <w:r>
-        <w:rPr>
-          <w:rFonts w:ascii="Times New Roman" w:eastAsia="Times New Roman" w:hAnsi="Times New Roman" w:cs="Times New Roman"/>
-          <w:sz w:val="24"/>
-          <w:szCs w:val="24"/>
-        </w:rPr>
-        <w:t>[ ]</w:t>
-      </w:r>
-      <w:proofErr w:type="gramEnd"/>
-      <w:r>
-        <w:rPr>
-          <w:rFonts w:ascii="Times New Roman" w:eastAsia="Times New Roman" w:hAnsi="Times New Roman" w:cs="Times New Roman"/>
-          <w:sz w:val="24"/>
-          <w:szCs w:val="24"/>
-        </w:rPr>
-        <w:t xml:space="preserve"> Integration tests for invoice workflows (create → update → delete).</w:t>
+      <w:r>
+        <w:rPr>
+          <w:rFonts w:ascii="Times New Roman" w:eastAsia="Times New Roman" w:hAnsi="Times New Roman" w:cs="Times New Roman"/>
+          <w:sz w:val="24"/>
+          <w:szCs w:val="24"/>
+        </w:rPr>
+        <w:t>[ ] Integration tests for invoice workflows (create → update → delete).</w:t>
       </w:r>
     </w:p>
     <w:p>
@@ -13189,23 +12626,13 @@
           <w:szCs w:val="24"/>
         </w:rPr>
       </w:pPr>
-      <w:proofErr w:type="gramStart"/>
-      <w:r>
-        <w:rPr>
-          <w:rFonts w:ascii="Times New Roman" w:eastAsia="Times New Roman" w:hAnsi="Times New Roman" w:cs="Times New Roman"/>
-          <w:sz w:val="24"/>
-          <w:szCs w:val="24"/>
-        </w:rPr>
-        <w:t>[ ]</w:t>
-      </w:r>
-      <w:proofErr w:type="gramEnd"/>
-      <w:r>
-        <w:rPr>
-          <w:rFonts w:ascii="Times New Roman" w:eastAsia="Times New Roman" w:hAnsi="Times New Roman" w:cs="Times New Roman"/>
-          <w:sz w:val="24"/>
-          <w:szCs w:val="24"/>
-        </w:rPr>
-        <w:t xml:space="preserve"> Demo seeding (</w:t>
+      <w:r>
+        <w:rPr>
+          <w:rFonts w:ascii="Times New Roman" w:eastAsia="Times New Roman" w:hAnsi="Times New Roman" w:cs="Times New Roman"/>
+          <w:sz w:val="24"/>
+          <w:szCs w:val="24"/>
+        </w:rPr>
+        <w:t>[ ] Demo seeding (</w:t>
       </w:r>
       <w:r>
         <w:rPr>
@@ -13237,23 +12664,13 @@
           <w:szCs w:val="24"/>
         </w:rPr>
       </w:pPr>
-      <w:proofErr w:type="gramStart"/>
-      <w:r>
-        <w:rPr>
-          <w:rFonts w:ascii="Times New Roman" w:eastAsia="Times New Roman" w:hAnsi="Times New Roman" w:cs="Times New Roman"/>
-          <w:sz w:val="24"/>
-          <w:szCs w:val="24"/>
-        </w:rPr>
-        <w:t>[ ]</w:t>
-      </w:r>
-      <w:proofErr w:type="gramEnd"/>
-      <w:r>
-        <w:rPr>
-          <w:rFonts w:ascii="Times New Roman" w:eastAsia="Times New Roman" w:hAnsi="Times New Roman" w:cs="Times New Roman"/>
-          <w:sz w:val="24"/>
-          <w:szCs w:val="24"/>
-        </w:rPr>
-        <w:t xml:space="preserve"> Coverage threshold enforced (≥80%).</w:t>
+      <w:r>
+        <w:rPr>
+          <w:rFonts w:ascii="Times New Roman" w:eastAsia="Times New Roman" w:hAnsi="Times New Roman" w:cs="Times New Roman"/>
+          <w:sz w:val="24"/>
+          <w:szCs w:val="24"/>
+        </w:rPr>
+        <w:t>[ ] Coverage threshold enforced (≥80%).</w:t>
       </w:r>
     </w:p>
     <w:p>
@@ -13269,23 +12686,13 @@
           <w:szCs w:val="24"/>
         </w:rPr>
       </w:pPr>
-      <w:proofErr w:type="gramStart"/>
-      <w:r>
-        <w:rPr>
-          <w:rFonts w:ascii="Times New Roman" w:eastAsia="Times New Roman" w:hAnsi="Times New Roman" w:cs="Times New Roman"/>
-          <w:sz w:val="24"/>
-          <w:szCs w:val="24"/>
-        </w:rPr>
-        <w:t>[ ]</w:t>
-      </w:r>
-      <w:proofErr w:type="gramEnd"/>
-      <w:r>
-        <w:rPr>
-          <w:rFonts w:ascii="Times New Roman" w:eastAsia="Times New Roman" w:hAnsi="Times New Roman" w:cs="Times New Roman"/>
-          <w:sz w:val="24"/>
-          <w:szCs w:val="24"/>
-        </w:rPr>
-        <w:t xml:space="preserve"> Pipeline step: run invoice tests + seed demo invoices.</w:t>
+      <w:r>
+        <w:rPr>
+          <w:rFonts w:ascii="Times New Roman" w:eastAsia="Times New Roman" w:hAnsi="Times New Roman" w:cs="Times New Roman"/>
+          <w:sz w:val="24"/>
+          <w:szCs w:val="24"/>
+        </w:rPr>
+        <w:t>[ ] Pipeline step: run invoice tests + seed demo invoices.</w:t>
       </w:r>
     </w:p>
     <w:p>
@@ -13324,23 +12731,13 @@
           <w:szCs w:val="24"/>
         </w:rPr>
       </w:pPr>
-      <w:proofErr w:type="gramStart"/>
-      <w:r>
-        <w:rPr>
-          <w:rFonts w:ascii="Times New Roman" w:eastAsia="Times New Roman" w:hAnsi="Times New Roman" w:cs="Times New Roman"/>
-          <w:sz w:val="24"/>
-          <w:szCs w:val="24"/>
-        </w:rPr>
-        <w:t>[ ]</w:t>
-      </w:r>
-      <w:proofErr w:type="gramEnd"/>
-      <w:r>
-        <w:rPr>
-          <w:rFonts w:ascii="Times New Roman" w:eastAsia="Times New Roman" w:hAnsi="Times New Roman" w:cs="Times New Roman"/>
-          <w:sz w:val="24"/>
-          <w:szCs w:val="24"/>
-        </w:rPr>
-        <w:t xml:space="preserve"> Unit tests for transactions (success, failure, refund).</w:t>
+      <w:r>
+        <w:rPr>
+          <w:rFonts w:ascii="Times New Roman" w:eastAsia="Times New Roman" w:hAnsi="Times New Roman" w:cs="Times New Roman"/>
+          <w:sz w:val="24"/>
+          <w:szCs w:val="24"/>
+        </w:rPr>
+        <w:t>[ ] Unit tests for transactions (success, failure, refund).</w:t>
       </w:r>
     </w:p>
     <w:p>
@@ -13356,23 +12753,13 @@
           <w:szCs w:val="24"/>
         </w:rPr>
       </w:pPr>
-      <w:proofErr w:type="gramStart"/>
-      <w:r>
-        <w:rPr>
-          <w:rFonts w:ascii="Times New Roman" w:eastAsia="Times New Roman" w:hAnsi="Times New Roman" w:cs="Times New Roman"/>
-          <w:sz w:val="24"/>
-          <w:szCs w:val="24"/>
-        </w:rPr>
-        <w:t>[ ]</w:t>
-      </w:r>
-      <w:proofErr w:type="gramEnd"/>
-      <w:r>
-        <w:rPr>
-          <w:rFonts w:ascii="Times New Roman" w:eastAsia="Times New Roman" w:hAnsi="Times New Roman" w:cs="Times New Roman"/>
-          <w:sz w:val="24"/>
-          <w:szCs w:val="24"/>
-        </w:rPr>
-        <w:t xml:space="preserve"> RBAC tests (who can initiate, approve, refund).</w:t>
+      <w:r>
+        <w:rPr>
+          <w:rFonts w:ascii="Times New Roman" w:eastAsia="Times New Roman" w:hAnsi="Times New Roman" w:cs="Times New Roman"/>
+          <w:sz w:val="24"/>
+          <w:szCs w:val="24"/>
+        </w:rPr>
+        <w:t>[ ] RBAC tests (who can initiate, approve, refund).</w:t>
       </w:r>
     </w:p>
     <w:p>
@@ -13388,23 +12775,13 @@
           <w:szCs w:val="24"/>
         </w:rPr>
       </w:pPr>
-      <w:proofErr w:type="gramStart"/>
-      <w:r>
-        <w:rPr>
-          <w:rFonts w:ascii="Times New Roman" w:eastAsia="Times New Roman" w:hAnsi="Times New Roman" w:cs="Times New Roman"/>
-          <w:sz w:val="24"/>
-          <w:szCs w:val="24"/>
-        </w:rPr>
-        <w:t>[ ]</w:t>
-      </w:r>
-      <w:proofErr w:type="gramEnd"/>
-      <w:r>
-        <w:rPr>
-          <w:rFonts w:ascii="Times New Roman" w:eastAsia="Times New Roman" w:hAnsi="Times New Roman" w:cs="Times New Roman"/>
-          <w:sz w:val="24"/>
-          <w:szCs w:val="24"/>
-        </w:rPr>
-        <w:t xml:space="preserve"> Integration tests linking invoices ↔ payments.</w:t>
+      <w:r>
+        <w:rPr>
+          <w:rFonts w:ascii="Times New Roman" w:eastAsia="Times New Roman" w:hAnsi="Times New Roman" w:cs="Times New Roman"/>
+          <w:sz w:val="24"/>
+          <w:szCs w:val="24"/>
+        </w:rPr>
+        <w:t>[ ] Integration tests linking invoices ↔ payments.</w:t>
       </w:r>
     </w:p>
     <w:p>
@@ -13420,23 +12797,13 @@
           <w:szCs w:val="24"/>
         </w:rPr>
       </w:pPr>
-      <w:proofErr w:type="gramStart"/>
-      <w:r>
-        <w:rPr>
-          <w:rFonts w:ascii="Times New Roman" w:eastAsia="Times New Roman" w:hAnsi="Times New Roman" w:cs="Times New Roman"/>
-          <w:sz w:val="24"/>
-          <w:szCs w:val="24"/>
-        </w:rPr>
-        <w:t>[ ]</w:t>
-      </w:r>
-      <w:proofErr w:type="gramEnd"/>
-      <w:r>
-        <w:rPr>
-          <w:rFonts w:ascii="Times New Roman" w:eastAsia="Times New Roman" w:hAnsi="Times New Roman" w:cs="Times New Roman"/>
-          <w:sz w:val="24"/>
-          <w:szCs w:val="24"/>
-        </w:rPr>
-        <w:t xml:space="preserve"> Demo seeding (</w:t>
+      <w:r>
+        <w:rPr>
+          <w:rFonts w:ascii="Times New Roman" w:eastAsia="Times New Roman" w:hAnsi="Times New Roman" w:cs="Times New Roman"/>
+          <w:sz w:val="24"/>
+          <w:szCs w:val="24"/>
+        </w:rPr>
+        <w:t>[ ] Demo seeding (</w:t>
       </w:r>
       <w:r>
         <w:rPr>
@@ -13468,23 +12835,13 @@
           <w:szCs w:val="24"/>
         </w:rPr>
       </w:pPr>
-      <w:proofErr w:type="gramStart"/>
-      <w:r>
-        <w:rPr>
-          <w:rFonts w:ascii="Times New Roman" w:eastAsia="Times New Roman" w:hAnsi="Times New Roman" w:cs="Times New Roman"/>
-          <w:sz w:val="24"/>
-          <w:szCs w:val="24"/>
-        </w:rPr>
-        <w:t>[ ]</w:t>
-      </w:r>
-      <w:proofErr w:type="gramEnd"/>
-      <w:r>
-        <w:rPr>
-          <w:rFonts w:ascii="Times New Roman" w:eastAsia="Times New Roman" w:hAnsi="Times New Roman" w:cs="Times New Roman"/>
-          <w:sz w:val="24"/>
-          <w:szCs w:val="24"/>
-        </w:rPr>
-        <w:t xml:space="preserve"> Coverage threshold enforced (≥80%).</w:t>
+      <w:r>
+        <w:rPr>
+          <w:rFonts w:ascii="Times New Roman" w:eastAsia="Times New Roman" w:hAnsi="Times New Roman" w:cs="Times New Roman"/>
+          <w:sz w:val="24"/>
+          <w:szCs w:val="24"/>
+        </w:rPr>
+        <w:t>[ ] Coverage threshold enforced (≥80%).</w:t>
       </w:r>
     </w:p>
     <w:p>
@@ -13500,23 +12857,13 @@
           <w:szCs w:val="24"/>
         </w:rPr>
       </w:pPr>
-      <w:proofErr w:type="gramStart"/>
-      <w:r>
-        <w:rPr>
-          <w:rFonts w:ascii="Times New Roman" w:eastAsia="Times New Roman" w:hAnsi="Times New Roman" w:cs="Times New Roman"/>
-          <w:sz w:val="24"/>
-          <w:szCs w:val="24"/>
-        </w:rPr>
-        <w:t>[ ]</w:t>
-      </w:r>
-      <w:proofErr w:type="gramEnd"/>
-      <w:r>
-        <w:rPr>
-          <w:rFonts w:ascii="Times New Roman" w:eastAsia="Times New Roman" w:hAnsi="Times New Roman" w:cs="Times New Roman"/>
-          <w:sz w:val="24"/>
-          <w:szCs w:val="24"/>
-        </w:rPr>
-        <w:t xml:space="preserve"> Pipeline step: run payment tests + seed demo payments.</w:t>
+      <w:r>
+        <w:rPr>
+          <w:rFonts w:ascii="Times New Roman" w:eastAsia="Times New Roman" w:hAnsi="Times New Roman" w:cs="Times New Roman"/>
+          <w:sz w:val="24"/>
+          <w:szCs w:val="24"/>
+        </w:rPr>
+        <w:t>[ ] Pipeline step: run payment tests + seed demo payments.</w:t>
       </w:r>
     </w:p>
     <w:p>
@@ -13555,23 +12902,13 @@
           <w:szCs w:val="24"/>
         </w:rPr>
       </w:pPr>
-      <w:proofErr w:type="gramStart"/>
-      <w:r>
-        <w:rPr>
-          <w:rFonts w:ascii="Times New Roman" w:eastAsia="Times New Roman" w:hAnsi="Times New Roman" w:cs="Times New Roman"/>
-          <w:sz w:val="24"/>
-          <w:szCs w:val="24"/>
-        </w:rPr>
-        <w:t>[ ]</w:t>
-      </w:r>
-      <w:proofErr w:type="gramEnd"/>
-      <w:r>
-        <w:rPr>
-          <w:rFonts w:ascii="Times New Roman" w:eastAsia="Times New Roman" w:hAnsi="Times New Roman" w:cs="Times New Roman"/>
-          <w:sz w:val="24"/>
-          <w:szCs w:val="24"/>
-        </w:rPr>
-        <w:t xml:space="preserve"> Unit tests for stock items, warehouses, movements.</w:t>
+      <w:r>
+        <w:rPr>
+          <w:rFonts w:ascii="Times New Roman" w:eastAsia="Times New Roman" w:hAnsi="Times New Roman" w:cs="Times New Roman"/>
+          <w:sz w:val="24"/>
+          <w:szCs w:val="24"/>
+        </w:rPr>
+        <w:t>[ ] Unit tests for stock items, warehouses, movements.</w:t>
       </w:r>
     </w:p>
     <w:p>
@@ -13587,23 +12924,13 @@
           <w:szCs w:val="24"/>
         </w:rPr>
       </w:pPr>
-      <w:proofErr w:type="gramStart"/>
-      <w:r>
-        <w:rPr>
-          <w:rFonts w:ascii="Times New Roman" w:eastAsia="Times New Roman" w:hAnsi="Times New Roman" w:cs="Times New Roman"/>
-          <w:sz w:val="24"/>
-          <w:szCs w:val="24"/>
-        </w:rPr>
-        <w:t>[ ]</w:t>
-      </w:r>
-      <w:proofErr w:type="gramEnd"/>
-      <w:r>
-        <w:rPr>
-          <w:rFonts w:ascii="Times New Roman" w:eastAsia="Times New Roman" w:hAnsi="Times New Roman" w:cs="Times New Roman"/>
-          <w:sz w:val="24"/>
-          <w:szCs w:val="24"/>
-        </w:rPr>
-        <w:t xml:space="preserve"> RBAC tests (who can update/view stock).</w:t>
+      <w:r>
+        <w:rPr>
+          <w:rFonts w:ascii="Times New Roman" w:eastAsia="Times New Roman" w:hAnsi="Times New Roman" w:cs="Times New Roman"/>
+          <w:sz w:val="24"/>
+          <w:szCs w:val="24"/>
+        </w:rPr>
+        <w:t>[ ] RBAC tests (who can update/view stock).</w:t>
       </w:r>
     </w:p>
     <w:p>
@@ -13619,23 +12946,13 @@
           <w:szCs w:val="24"/>
         </w:rPr>
       </w:pPr>
-      <w:proofErr w:type="gramStart"/>
-      <w:r>
-        <w:rPr>
-          <w:rFonts w:ascii="Times New Roman" w:eastAsia="Times New Roman" w:hAnsi="Times New Roman" w:cs="Times New Roman"/>
-          <w:sz w:val="24"/>
-          <w:szCs w:val="24"/>
-        </w:rPr>
-        <w:t>[ ]</w:t>
-      </w:r>
-      <w:proofErr w:type="gramEnd"/>
-      <w:r>
-        <w:rPr>
-          <w:rFonts w:ascii="Times New Roman" w:eastAsia="Times New Roman" w:hAnsi="Times New Roman" w:cs="Times New Roman"/>
-          <w:sz w:val="24"/>
-          <w:szCs w:val="24"/>
-        </w:rPr>
-        <w:t xml:space="preserve"> Integration tests linking sales ↔ inventory movements.</w:t>
+      <w:r>
+        <w:rPr>
+          <w:rFonts w:ascii="Times New Roman" w:eastAsia="Times New Roman" w:hAnsi="Times New Roman" w:cs="Times New Roman"/>
+          <w:sz w:val="24"/>
+          <w:szCs w:val="24"/>
+        </w:rPr>
+        <w:t>[ ] Integration tests linking sales ↔ inventory movements.</w:t>
       </w:r>
     </w:p>
     <w:p>
@@ -13651,23 +12968,13 @@
           <w:szCs w:val="24"/>
         </w:rPr>
       </w:pPr>
-      <w:proofErr w:type="gramStart"/>
-      <w:r>
-        <w:rPr>
-          <w:rFonts w:ascii="Times New Roman" w:eastAsia="Times New Roman" w:hAnsi="Times New Roman" w:cs="Times New Roman"/>
-          <w:sz w:val="24"/>
-          <w:szCs w:val="24"/>
-        </w:rPr>
-        <w:t>[ ]</w:t>
-      </w:r>
-      <w:proofErr w:type="gramEnd"/>
-      <w:r>
-        <w:rPr>
-          <w:rFonts w:ascii="Times New Roman" w:eastAsia="Times New Roman" w:hAnsi="Times New Roman" w:cs="Times New Roman"/>
-          <w:sz w:val="24"/>
-          <w:szCs w:val="24"/>
-        </w:rPr>
-        <w:t xml:space="preserve"> Demo seeding (</w:t>
+      <w:r>
+        <w:rPr>
+          <w:rFonts w:ascii="Times New Roman" w:eastAsia="Times New Roman" w:hAnsi="Times New Roman" w:cs="Times New Roman"/>
+          <w:sz w:val="24"/>
+          <w:szCs w:val="24"/>
+        </w:rPr>
+        <w:t>[ ] Demo seeding (</w:t>
       </w:r>
       <w:r>
         <w:rPr>
@@ -13699,23 +13006,13 @@
           <w:szCs w:val="24"/>
         </w:rPr>
       </w:pPr>
-      <w:proofErr w:type="gramStart"/>
-      <w:r>
-        <w:rPr>
-          <w:rFonts w:ascii="Times New Roman" w:eastAsia="Times New Roman" w:hAnsi="Times New Roman" w:cs="Times New Roman"/>
-          <w:sz w:val="24"/>
-          <w:szCs w:val="24"/>
-        </w:rPr>
-        <w:t>[ ]</w:t>
-      </w:r>
-      <w:proofErr w:type="gramEnd"/>
-      <w:r>
-        <w:rPr>
-          <w:rFonts w:ascii="Times New Roman" w:eastAsia="Times New Roman" w:hAnsi="Times New Roman" w:cs="Times New Roman"/>
-          <w:sz w:val="24"/>
-          <w:szCs w:val="24"/>
-        </w:rPr>
-        <w:t xml:space="preserve"> Coverage threshold enforced (≥80%).</w:t>
+      <w:r>
+        <w:rPr>
+          <w:rFonts w:ascii="Times New Roman" w:eastAsia="Times New Roman" w:hAnsi="Times New Roman" w:cs="Times New Roman"/>
+          <w:sz w:val="24"/>
+          <w:szCs w:val="24"/>
+        </w:rPr>
+        <w:t>[ ] Coverage threshold enforced (≥80%).</w:t>
       </w:r>
     </w:p>
     <w:p>
@@ -13731,23 +13028,13 @@
           <w:szCs w:val="24"/>
         </w:rPr>
       </w:pPr>
-      <w:proofErr w:type="gramStart"/>
-      <w:r>
-        <w:rPr>
-          <w:rFonts w:ascii="Times New Roman" w:eastAsia="Times New Roman" w:hAnsi="Times New Roman" w:cs="Times New Roman"/>
-          <w:sz w:val="24"/>
-          <w:szCs w:val="24"/>
-        </w:rPr>
-        <w:t>[ ]</w:t>
-      </w:r>
-      <w:proofErr w:type="gramEnd"/>
-      <w:r>
-        <w:rPr>
-          <w:rFonts w:ascii="Times New Roman" w:eastAsia="Times New Roman" w:hAnsi="Times New Roman" w:cs="Times New Roman"/>
-          <w:sz w:val="24"/>
-          <w:szCs w:val="24"/>
-        </w:rPr>
-        <w:t xml:space="preserve"> Pipeline step: run inventory tests + seed demo inventory.</w:t>
+      <w:r>
+        <w:rPr>
+          <w:rFonts w:ascii="Times New Roman" w:eastAsia="Times New Roman" w:hAnsi="Times New Roman" w:cs="Times New Roman"/>
+          <w:sz w:val="24"/>
+          <w:szCs w:val="24"/>
+        </w:rPr>
+        <w:t>[ ] Pipeline step: run inventory tests + seed demo inventory.</w:t>
       </w:r>
     </w:p>
     <w:p>
@@ -13786,23 +13073,13 @@
           <w:szCs w:val="24"/>
         </w:rPr>
       </w:pPr>
-      <w:proofErr w:type="gramStart"/>
-      <w:r>
-        <w:rPr>
-          <w:rFonts w:ascii="Times New Roman" w:eastAsia="Times New Roman" w:hAnsi="Times New Roman" w:cs="Times New Roman"/>
-          <w:sz w:val="24"/>
-          <w:szCs w:val="24"/>
-        </w:rPr>
-        <w:t>[ ]</w:t>
-      </w:r>
-      <w:proofErr w:type="gramEnd"/>
-      <w:r>
-        <w:rPr>
-          <w:rFonts w:ascii="Times New Roman" w:eastAsia="Times New Roman" w:hAnsi="Times New Roman" w:cs="Times New Roman"/>
-          <w:sz w:val="24"/>
-          <w:szCs w:val="24"/>
-        </w:rPr>
-        <w:t xml:space="preserve"> Unit tests for tickets, agents, feedback.</w:t>
+      <w:r>
+        <w:rPr>
+          <w:rFonts w:ascii="Times New Roman" w:eastAsia="Times New Roman" w:hAnsi="Times New Roman" w:cs="Times New Roman"/>
+          <w:sz w:val="24"/>
+          <w:szCs w:val="24"/>
+        </w:rPr>
+        <w:t>[ ] Unit tests for tickets, agents, feedback.</w:t>
       </w:r>
     </w:p>
     <w:p>
@@ -13818,23 +13095,13 @@
           <w:szCs w:val="24"/>
         </w:rPr>
       </w:pPr>
-      <w:proofErr w:type="gramStart"/>
-      <w:r>
-        <w:rPr>
-          <w:rFonts w:ascii="Times New Roman" w:eastAsia="Times New Roman" w:hAnsi="Times New Roman" w:cs="Times New Roman"/>
-          <w:sz w:val="24"/>
-          <w:szCs w:val="24"/>
-        </w:rPr>
-        <w:t>[ ]</w:t>
-      </w:r>
-      <w:proofErr w:type="gramEnd"/>
-      <w:r>
-        <w:rPr>
-          <w:rFonts w:ascii="Times New Roman" w:eastAsia="Times New Roman" w:hAnsi="Times New Roman" w:cs="Times New Roman"/>
-          <w:sz w:val="24"/>
-          <w:szCs w:val="24"/>
-        </w:rPr>
-        <w:t xml:space="preserve"> RBAC tests (who can view, update, close tickets).</w:t>
+      <w:r>
+        <w:rPr>
+          <w:rFonts w:ascii="Times New Roman" w:eastAsia="Times New Roman" w:hAnsi="Times New Roman" w:cs="Times New Roman"/>
+          <w:sz w:val="24"/>
+          <w:szCs w:val="24"/>
+        </w:rPr>
+        <w:t>[ ] RBAC tests (who can view, update, close tickets).</w:t>
       </w:r>
     </w:p>
     <w:p>
@@ -13850,23 +13117,13 @@
           <w:szCs w:val="24"/>
         </w:rPr>
       </w:pPr>
-      <w:proofErr w:type="gramStart"/>
-      <w:r>
-        <w:rPr>
-          <w:rFonts w:ascii="Times New Roman" w:eastAsia="Times New Roman" w:hAnsi="Times New Roman" w:cs="Times New Roman"/>
-          <w:sz w:val="24"/>
-          <w:szCs w:val="24"/>
-        </w:rPr>
-        <w:t>[ ]</w:t>
-      </w:r>
-      <w:proofErr w:type="gramEnd"/>
-      <w:r>
-        <w:rPr>
-          <w:rFonts w:ascii="Times New Roman" w:eastAsia="Times New Roman" w:hAnsi="Times New Roman" w:cs="Times New Roman"/>
-          <w:sz w:val="24"/>
-          <w:szCs w:val="24"/>
-        </w:rPr>
-        <w:t xml:space="preserve"> Integration tests linking CRM ↔ tenants/customers.</w:t>
+      <w:r>
+        <w:rPr>
+          <w:rFonts w:ascii="Times New Roman" w:eastAsia="Times New Roman" w:hAnsi="Times New Roman" w:cs="Times New Roman"/>
+          <w:sz w:val="24"/>
+          <w:szCs w:val="24"/>
+        </w:rPr>
+        <w:t>[ ] Integration tests linking CRM ↔ tenants/customers.</w:t>
       </w:r>
     </w:p>
     <w:p>
@@ -13882,23 +13139,13 @@
           <w:szCs w:val="24"/>
         </w:rPr>
       </w:pPr>
-      <w:proofErr w:type="gramStart"/>
-      <w:r>
-        <w:rPr>
-          <w:rFonts w:ascii="Times New Roman" w:eastAsia="Times New Roman" w:hAnsi="Times New Roman" w:cs="Times New Roman"/>
-          <w:sz w:val="24"/>
-          <w:szCs w:val="24"/>
-        </w:rPr>
-        <w:t>[ ]</w:t>
-      </w:r>
-      <w:proofErr w:type="gramEnd"/>
-      <w:r>
-        <w:rPr>
-          <w:rFonts w:ascii="Times New Roman" w:eastAsia="Times New Roman" w:hAnsi="Times New Roman" w:cs="Times New Roman"/>
-          <w:sz w:val="24"/>
-          <w:szCs w:val="24"/>
-        </w:rPr>
-        <w:t xml:space="preserve"> Demo seeding (</w:t>
+      <w:r>
+        <w:rPr>
+          <w:rFonts w:ascii="Times New Roman" w:eastAsia="Times New Roman" w:hAnsi="Times New Roman" w:cs="Times New Roman"/>
+          <w:sz w:val="24"/>
+          <w:szCs w:val="24"/>
+        </w:rPr>
+        <w:t>[ ] Demo seeding (</w:t>
       </w:r>
       <w:r>
         <w:rPr>
@@ -13940,23 +13187,13 @@
           <w:szCs w:val="24"/>
         </w:rPr>
       </w:pPr>
-      <w:proofErr w:type="gramStart"/>
-      <w:r>
-        <w:rPr>
-          <w:rFonts w:ascii="Times New Roman" w:eastAsia="Times New Roman" w:hAnsi="Times New Roman" w:cs="Times New Roman"/>
-          <w:sz w:val="24"/>
-          <w:szCs w:val="24"/>
-        </w:rPr>
-        <w:t>[ ]</w:t>
-      </w:r>
-      <w:proofErr w:type="gramEnd"/>
-      <w:r>
-        <w:rPr>
-          <w:rFonts w:ascii="Times New Roman" w:eastAsia="Times New Roman" w:hAnsi="Times New Roman" w:cs="Times New Roman"/>
-          <w:sz w:val="24"/>
-          <w:szCs w:val="24"/>
-        </w:rPr>
-        <w:t xml:space="preserve"> Coverage threshold enforced (≥80%).</w:t>
+      <w:r>
+        <w:rPr>
+          <w:rFonts w:ascii="Times New Roman" w:eastAsia="Times New Roman" w:hAnsi="Times New Roman" w:cs="Times New Roman"/>
+          <w:sz w:val="24"/>
+          <w:szCs w:val="24"/>
+        </w:rPr>
+        <w:t>[ ] Coverage threshold enforced (≥80%).</w:t>
       </w:r>
     </w:p>
     <w:p>
@@ -13972,23 +13209,13 @@
           <w:szCs w:val="24"/>
         </w:rPr>
       </w:pPr>
-      <w:proofErr w:type="gramStart"/>
-      <w:r>
-        <w:rPr>
-          <w:rFonts w:ascii="Times New Roman" w:eastAsia="Times New Roman" w:hAnsi="Times New Roman" w:cs="Times New Roman"/>
-          <w:sz w:val="24"/>
-          <w:szCs w:val="24"/>
-        </w:rPr>
-        <w:t>[ ]</w:t>
-      </w:r>
-      <w:proofErr w:type="gramEnd"/>
-      <w:r>
-        <w:rPr>
-          <w:rFonts w:ascii="Times New Roman" w:eastAsia="Times New Roman" w:hAnsi="Times New Roman" w:cs="Times New Roman"/>
-          <w:sz w:val="24"/>
-          <w:szCs w:val="24"/>
-        </w:rPr>
-        <w:t xml:space="preserve"> Pipeline step: run CRM tests + seed demo CRM data.</w:t>
+      <w:r>
+        <w:rPr>
+          <w:rFonts w:ascii="Times New Roman" w:eastAsia="Times New Roman" w:hAnsi="Times New Roman" w:cs="Times New Roman"/>
+          <w:sz w:val="24"/>
+          <w:szCs w:val="24"/>
+        </w:rPr>
+        <w:t>[ ] Pipeline step: run CRM tests + seed demo CRM data.</w:t>
       </w:r>
     </w:p>
     <w:p>
@@ -14037,7 +13264,6 @@
           <w:szCs w:val="24"/>
         </w:rPr>
       </w:pPr>
-      <w:proofErr w:type="gramStart"/>
       <w:r>
         <w:rPr>
           <w:rFonts w:ascii="Times New Roman" w:eastAsia="Times New Roman" w:hAnsi="Times New Roman" w:cs="Times New Roman"/>
@@ -14045,16 +13271,7 @@
           <w:szCs w:val="24"/>
         </w:rPr>
         <w:lastRenderedPageBreak/>
-        <w:t>[ ]</w:t>
-      </w:r>
-      <w:proofErr w:type="gramEnd"/>
-      <w:r>
-        <w:rPr>
-          <w:rFonts w:ascii="Times New Roman" w:eastAsia="Times New Roman" w:hAnsi="Times New Roman" w:cs="Times New Roman"/>
-          <w:sz w:val="24"/>
-          <w:szCs w:val="24"/>
-        </w:rPr>
-        <w:t xml:space="preserve"> </w:t>
+        <w:t xml:space="preserve">[ ] </w:t>
       </w:r>
       <w:r>
         <w:rPr>
@@ -14088,23 +13305,13 @@
           <w:szCs w:val="24"/>
         </w:rPr>
       </w:pPr>
-      <w:proofErr w:type="gramStart"/>
-      <w:r>
-        <w:rPr>
-          <w:rFonts w:ascii="Times New Roman" w:eastAsia="Times New Roman" w:hAnsi="Times New Roman" w:cs="Times New Roman"/>
-          <w:sz w:val="24"/>
-          <w:szCs w:val="24"/>
-        </w:rPr>
-        <w:t>[ ]</w:t>
-      </w:r>
-      <w:proofErr w:type="gramEnd"/>
-      <w:r>
-        <w:rPr>
-          <w:rFonts w:ascii="Times New Roman" w:eastAsia="Times New Roman" w:hAnsi="Times New Roman" w:cs="Times New Roman"/>
-          <w:sz w:val="24"/>
-          <w:szCs w:val="24"/>
-        </w:rPr>
-        <w:t xml:space="preserve"> </w:t>
+      <w:r>
+        <w:rPr>
+          <w:rFonts w:ascii="Times New Roman" w:eastAsia="Times New Roman" w:hAnsi="Times New Roman" w:cs="Times New Roman"/>
+          <w:sz w:val="24"/>
+          <w:szCs w:val="24"/>
+        </w:rPr>
+        <w:t xml:space="preserve">[ ] </w:t>
       </w:r>
       <w:r>
         <w:rPr>
@@ -14138,23 +13345,13 @@
           <w:szCs w:val="24"/>
         </w:rPr>
       </w:pPr>
-      <w:proofErr w:type="gramStart"/>
-      <w:r>
-        <w:rPr>
-          <w:rFonts w:ascii="Times New Roman" w:eastAsia="Times New Roman" w:hAnsi="Times New Roman" w:cs="Times New Roman"/>
-          <w:sz w:val="24"/>
-          <w:szCs w:val="24"/>
-        </w:rPr>
-        <w:t>[ ]</w:t>
-      </w:r>
-      <w:proofErr w:type="gramEnd"/>
-      <w:r>
-        <w:rPr>
-          <w:rFonts w:ascii="Times New Roman" w:eastAsia="Times New Roman" w:hAnsi="Times New Roman" w:cs="Times New Roman"/>
-          <w:sz w:val="24"/>
-          <w:szCs w:val="24"/>
-        </w:rPr>
-        <w:t xml:space="preserve"> </w:t>
+      <w:r>
+        <w:rPr>
+          <w:rFonts w:ascii="Times New Roman" w:eastAsia="Times New Roman" w:hAnsi="Times New Roman" w:cs="Times New Roman"/>
+          <w:sz w:val="24"/>
+          <w:szCs w:val="24"/>
+        </w:rPr>
+        <w:t xml:space="preserve">[ ] </w:t>
       </w:r>
       <w:r>
         <w:rPr>
@@ -14188,23 +13385,13 @@
           <w:szCs w:val="24"/>
         </w:rPr>
       </w:pPr>
-      <w:proofErr w:type="gramStart"/>
-      <w:r>
-        <w:rPr>
-          <w:rFonts w:ascii="Times New Roman" w:eastAsia="Times New Roman" w:hAnsi="Times New Roman" w:cs="Times New Roman"/>
-          <w:sz w:val="24"/>
-          <w:szCs w:val="24"/>
-        </w:rPr>
-        <w:t>[ ]</w:t>
-      </w:r>
-      <w:proofErr w:type="gramEnd"/>
-      <w:r>
-        <w:rPr>
-          <w:rFonts w:ascii="Times New Roman" w:eastAsia="Times New Roman" w:hAnsi="Times New Roman" w:cs="Times New Roman"/>
-          <w:sz w:val="24"/>
-          <w:szCs w:val="24"/>
-        </w:rPr>
-        <w:t xml:space="preserve"> </w:t>
+      <w:r>
+        <w:rPr>
+          <w:rFonts w:ascii="Times New Roman" w:eastAsia="Times New Roman" w:hAnsi="Times New Roman" w:cs="Times New Roman"/>
+          <w:sz w:val="24"/>
+          <w:szCs w:val="24"/>
+        </w:rPr>
+        <w:t xml:space="preserve">[ ] </w:t>
       </w:r>
       <w:r>
         <w:rPr>
@@ -14238,23 +13425,13 @@
           <w:szCs w:val="24"/>
         </w:rPr>
       </w:pPr>
-      <w:proofErr w:type="gramStart"/>
-      <w:r>
-        <w:rPr>
-          <w:rFonts w:ascii="Times New Roman" w:eastAsia="Times New Roman" w:hAnsi="Times New Roman" w:cs="Times New Roman"/>
-          <w:sz w:val="24"/>
-          <w:szCs w:val="24"/>
-        </w:rPr>
-        <w:t>[ ]</w:t>
-      </w:r>
-      <w:proofErr w:type="gramEnd"/>
-      <w:r>
-        <w:rPr>
-          <w:rFonts w:ascii="Times New Roman" w:eastAsia="Times New Roman" w:hAnsi="Times New Roman" w:cs="Times New Roman"/>
-          <w:sz w:val="24"/>
-          <w:szCs w:val="24"/>
-        </w:rPr>
-        <w:t xml:space="preserve"> </w:t>
+      <w:r>
+        <w:rPr>
+          <w:rFonts w:ascii="Times New Roman" w:eastAsia="Times New Roman" w:hAnsi="Times New Roman" w:cs="Times New Roman"/>
+          <w:sz w:val="24"/>
+          <w:szCs w:val="24"/>
+        </w:rPr>
+        <w:t xml:space="preserve">[ ] </w:t>
       </w:r>
       <w:r>
         <w:rPr>
@@ -14288,23 +13465,13 @@
           <w:szCs w:val="24"/>
         </w:rPr>
       </w:pPr>
-      <w:proofErr w:type="gramStart"/>
-      <w:r>
-        <w:rPr>
-          <w:rFonts w:ascii="Times New Roman" w:eastAsia="Times New Roman" w:hAnsi="Times New Roman" w:cs="Times New Roman"/>
-          <w:sz w:val="24"/>
-          <w:szCs w:val="24"/>
-        </w:rPr>
-        <w:t>[ ]</w:t>
-      </w:r>
-      <w:proofErr w:type="gramEnd"/>
-      <w:r>
-        <w:rPr>
-          <w:rFonts w:ascii="Times New Roman" w:eastAsia="Times New Roman" w:hAnsi="Times New Roman" w:cs="Times New Roman"/>
-          <w:sz w:val="24"/>
-          <w:szCs w:val="24"/>
-        </w:rPr>
-        <w:t xml:space="preserve"> </w:t>
+      <w:r>
+        <w:rPr>
+          <w:rFonts w:ascii="Times New Roman" w:eastAsia="Times New Roman" w:hAnsi="Times New Roman" w:cs="Times New Roman"/>
+          <w:sz w:val="24"/>
+          <w:szCs w:val="24"/>
+        </w:rPr>
+        <w:t xml:space="preserve">[ ] </w:t>
       </w:r>
       <w:r>
         <w:rPr>
@@ -19501,8 +18668,95 @@
         <w:t xml:space="preserve"> (highlighting potential risks in each phase and mitigation strategies) so you’re fully prepared?</w:t>
       </w:r>
     </w:p>
-    <w:bookmarkEnd w:id="0"/>
     <w:p/>
+    <w:p/>
+    <w:p>
+      <w:pPr>
+        <w:pStyle w:val="Heading2"/>
+      </w:pPr>
+      <w:r>
+        <w:t>Next Steps You Might Consider</w:t>
+      </w:r>
+    </w:p>
+    <w:p>
+      <w:pPr>
+        <w:pStyle w:val="NormalWeb"/>
+        <w:numPr>
+          <w:ilvl w:val="0"/>
+          <w:numId w:val="48"/>
+        </w:numPr>
+      </w:pPr>
+      <w:r>
+        <w:t xml:space="preserve">Add </w:t>
+      </w:r>
+      <w:r>
+        <w:rPr>
+          <w:rStyle w:val="Strong"/>
+        </w:rPr>
+        <w:t>edge case tests</w:t>
+      </w:r>
+      <w:r>
+        <w:t>: e.g. very large amounts, invalid tenant IDs, or unsupported currencies.</w:t>
+      </w:r>
+    </w:p>
+    <w:p>
+      <w:pPr>
+        <w:pStyle w:val="NormalWeb"/>
+        <w:numPr>
+          <w:ilvl w:val="0"/>
+          <w:numId w:val="48"/>
+        </w:numPr>
+      </w:pPr>
+      <w:r>
+        <w:t xml:space="preserve">Add </w:t>
+      </w:r>
+      <w:r>
+        <w:rPr>
+          <w:rStyle w:val="Strong"/>
+        </w:rPr>
+        <w:t>audit trail checks</w:t>
+      </w:r>
+      <w:r>
+        <w:t>: confirm that invoice actions (create, update, mark paid) generate audit log entries.</w:t>
+      </w:r>
+    </w:p>
+    <w:p>
+      <w:pPr>
+        <w:pStyle w:val="NormalWeb"/>
+        <w:numPr>
+          <w:ilvl w:val="0"/>
+          <w:numId w:val="48"/>
+        </w:numPr>
+      </w:pPr>
+      <w:r>
+        <w:t xml:space="preserve">Add </w:t>
+      </w:r>
+      <w:r>
+        <w:rPr>
+          <w:rStyle w:val="Strong"/>
+        </w:rPr>
+        <w:t>performance tests</w:t>
+      </w:r>
+      <w:r>
+        <w:t>: simulate bulk invoice creation to ensure queries stay efficient.</w:t>
+      </w:r>
+    </w:p>
+    <w:p>
+      <w:pPr>
+        <w:pStyle w:val="NormalWeb"/>
+        <w:numPr>
+          <w:ilvl w:val="0"/>
+          <w:numId w:val="48"/>
+        </w:numPr>
+      </w:pPr>
+      <w:r>
+        <w:t>Integrate these tests into your CI/CD pipeline so you catch regressions automatically.</w:t>
+      </w:r>
+    </w:p>
+    <w:p>
+      <w:bookmarkStart w:id="0" w:name="_GoBack"/>
+      <w:bookmarkEnd w:id="0"/>
+    </w:p>
     <w:sectPr>
       <w:pgSz w:w="12240" w:h="15840"/>
       <w:pgMar w:top="1440" w:right="1440" w:bottom="1440" w:left="1440" w:header="720" w:footer="720" w:gutter="0"/>
@@ -21417,6 +20671,155 @@
     </w:lvl>
   </w:abstractNum>
   <w:abstractNum w:abstractNumId="13" w15:restartNumberingAfterBreak="0">
+    <w:nsid w:val="230128E5"/>
+    <w:multiLevelType w:val="multilevel"/>
+    <w:tmpl w:val="2B1A0076"/>
+    <w:lvl w:ilvl="0">
+      <w:start w:val="1"/>
+      <w:numFmt w:val="bullet"/>
+      <w:lvlText w:val=""/>
+      <w:lvlJc w:val="left"/>
+      <w:pPr>
+        <w:tabs>
+          <w:tab w:val="num" w:pos="720"/>
+        </w:tabs>
+        <w:ind w:left="720" w:hanging="360"/>
+      </w:pPr>
+      <w:rPr>
+        <w:rFonts w:ascii="Symbol" w:hAnsi="Symbol" w:hint="default"/>
+        <w:sz w:val="20"/>
+      </w:rPr>
+    </w:lvl>
+    <w:lvl w:ilvl="1" w:tentative="1">
+      <w:start w:val="1"/>
+      <w:numFmt w:val="bullet"/>
+      <w:lvlText w:val="o"/>
+      <w:lvlJc w:val="left"/>
+      <w:pPr>
+        <w:tabs>
+          <w:tab w:val="num" w:pos="1440"/>
+        </w:tabs>
+        <w:ind w:left="1440" w:hanging="360"/>
+      </w:pPr>
+      <w:rPr>
+        <w:rFonts w:ascii="Courier New" w:hAnsi="Courier New" w:hint="default"/>
+        <w:sz w:val="20"/>
+      </w:rPr>
+    </w:lvl>
+    <w:lvl w:ilvl="2" w:tentative="1">
+      <w:start w:val="1"/>
+      <w:numFmt w:val="bullet"/>
+      <w:lvlText w:val=""/>
+      <w:lvlJc w:val="left"/>
+      <w:pPr>
+        <w:tabs>
+          <w:tab w:val="num" w:pos="2160"/>
+        </w:tabs>
+        <w:ind w:left="2160" w:hanging="360"/>
+      </w:pPr>
+      <w:rPr>
+        <w:rFonts w:ascii="Wingdings" w:hAnsi="Wingdings" w:hint="default"/>
+        <w:sz w:val="20"/>
+      </w:rPr>
+    </w:lvl>
+    <w:lvl w:ilvl="3" w:tentative="1">
+      <w:start w:val="1"/>
+      <w:numFmt w:val="bullet"/>
+      <w:lvlText w:val=""/>
+      <w:lvlJc w:val="left"/>
+      <w:pPr>
+        <w:tabs>
+          <w:tab w:val="num" w:pos="2880"/>
+        </w:tabs>
+        <w:ind w:left="2880" w:hanging="360"/>
+      </w:pPr>
+      <w:rPr>
+        <w:rFonts w:ascii="Wingdings" w:hAnsi="Wingdings" w:hint="default"/>
+        <w:sz w:val="20"/>
+      </w:rPr>
+    </w:lvl>
+    <w:lvl w:ilvl="4" w:tentative="1">
+      <w:start w:val="1"/>
+      <w:numFmt w:val="bullet"/>
+      <w:lvlText w:val=""/>
+      <w:lvlJc w:val="left"/>
+      <w:pPr>
+        <w:tabs>
+          <w:tab w:val="num" w:pos="3600"/>
+        </w:tabs>
+        <w:ind w:left="3600" w:hanging="360"/>
+      </w:pPr>
+      <w:rPr>
+        <w:rFonts w:ascii="Wingdings" w:hAnsi="Wingdings" w:hint="default"/>
+        <w:sz w:val="20"/>
+      </w:rPr>
+    </w:lvl>
+    <w:lvl w:ilvl="5" w:tentative="1">
+      <w:start w:val="1"/>
+      <w:numFmt w:val="bullet"/>
+      <w:lvlText w:val=""/>
+      <w:lvlJc w:val="left"/>
+      <w:pPr>
+        <w:tabs>
+          <w:tab w:val="num" w:pos="4320"/>
+        </w:tabs>
+        <w:ind w:left="4320" w:hanging="360"/>
+      </w:pPr>
+      <w:rPr>
+        <w:rFonts w:ascii="Wingdings" w:hAnsi="Wingdings" w:hint="default"/>
+        <w:sz w:val="20"/>
+      </w:rPr>
+    </w:lvl>
+    <w:lvl w:ilvl="6" w:tentative="1">
+      <w:start w:val="1"/>
+      <w:numFmt w:val="bullet"/>
+      <w:lvlText w:val=""/>
+      <w:lvlJc w:val="left"/>
+      <w:pPr>
+        <w:tabs>
+          <w:tab w:val="num" w:pos="5040"/>
+        </w:tabs>
+        <w:ind w:left="5040" w:hanging="360"/>
+      </w:pPr>
+      <w:rPr>
+        <w:rFonts w:ascii="Wingdings" w:hAnsi="Wingdings" w:hint="default"/>
+        <w:sz w:val="20"/>
+      </w:rPr>
+    </w:lvl>
+    <w:lvl w:ilvl="7" w:tentative="1">
+      <w:start w:val="1"/>
+      <w:numFmt w:val="bullet"/>
+      <w:lvlText w:val=""/>
+      <w:lvlJc w:val="left"/>
+      <w:pPr>
+        <w:tabs>
+          <w:tab w:val="num" w:pos="5760"/>
+        </w:tabs>
+        <w:ind w:left="5760" w:hanging="360"/>
+      </w:pPr>
+      <w:rPr>
+        <w:rFonts w:ascii="Wingdings" w:hAnsi="Wingdings" w:hint="default"/>
+        <w:sz w:val="20"/>
+      </w:rPr>
+    </w:lvl>
+    <w:lvl w:ilvl="8" w:tentative="1">
+      <w:start w:val="1"/>
+      <w:numFmt w:val="bullet"/>
+      <w:lvlText w:val=""/>
+      <w:lvlJc w:val="left"/>
+      <w:pPr>
+        <w:tabs>
+          <w:tab w:val="num" w:pos="6480"/>
+        </w:tabs>
+        <w:ind w:left="6480" w:hanging="360"/>
+      </w:pPr>
+      <w:rPr>
+        <w:rFonts w:ascii="Wingdings" w:hAnsi="Wingdings" w:hint="default"/>
+        <w:sz w:val="20"/>
+      </w:rPr>
+    </w:lvl>
+  </w:abstractNum>
+  <w:abstractNum w:abstractNumId="14" w15:restartNumberingAfterBreak="0">
     <w:nsid w:val="231E7CD7"/>
     <w:multiLevelType w:val="multilevel"/>
     <w:tmpl w:val="3CE6C4F8"/>
@@ -21565,7 +20968,7 @@
       </w:rPr>
     </w:lvl>
   </w:abstractNum>
-  <w:abstractNum w:abstractNumId="14" w15:restartNumberingAfterBreak="0">
+  <w:abstractNum w:abstractNumId="15" w15:restartNumberingAfterBreak="0">
     <w:nsid w:val="23942A76"/>
     <w:multiLevelType w:val="multilevel"/>
     <w:tmpl w:val="4CE421A2"/>
@@ -21714,7 +21117,7 @@
       </w:rPr>
     </w:lvl>
   </w:abstractNum>
-  <w:abstractNum w:abstractNumId="15" w15:restartNumberingAfterBreak="0">
+  <w:abstractNum w:abstractNumId="16" w15:restartNumberingAfterBreak="0">
     <w:nsid w:val="25DE7F1D"/>
     <w:multiLevelType w:val="hybridMultilevel"/>
     <w:tmpl w:val="B6FE9CD8"/>
@@ -21859,7 +21262,7 @@
       </w:rPr>
     </w:lvl>
   </w:abstractNum>
-  <w:abstractNum w:abstractNumId="16" w15:restartNumberingAfterBreak="0">
+  <w:abstractNum w:abstractNumId="17" w15:restartNumberingAfterBreak="0">
     <w:nsid w:val="26577E42"/>
     <w:multiLevelType w:val="multilevel"/>
     <w:tmpl w:val="FE84D6B8"/>
@@ -22008,7 +21411,7 @@
       </w:rPr>
     </w:lvl>
   </w:abstractNum>
-  <w:abstractNum w:abstractNumId="17" w15:restartNumberingAfterBreak="0">
+  <w:abstractNum w:abstractNumId="18" w15:restartNumberingAfterBreak="0">
     <w:nsid w:val="2C050222"/>
     <w:multiLevelType w:val="multilevel"/>
     <w:tmpl w:val="03D67710"/>
@@ -22157,7 +21560,7 @@
       </w:rPr>
     </w:lvl>
   </w:abstractNum>
-  <w:abstractNum w:abstractNumId="18" w15:restartNumberingAfterBreak="0">
+  <w:abstractNum w:abstractNumId="19" w15:restartNumberingAfterBreak="0">
     <w:nsid w:val="2C771285"/>
     <w:multiLevelType w:val="multilevel"/>
     <w:tmpl w:val="590204FE"/>
@@ -22306,7 +21709,7 @@
       </w:rPr>
     </w:lvl>
   </w:abstractNum>
-  <w:abstractNum w:abstractNumId="19" w15:restartNumberingAfterBreak="0">
+  <w:abstractNum w:abstractNumId="20" w15:restartNumberingAfterBreak="0">
     <w:nsid w:val="37730498"/>
     <w:multiLevelType w:val="multilevel"/>
     <w:tmpl w:val="CFA46914"/>
@@ -22423,7 +21826,7 @@
       </w:pPr>
     </w:lvl>
   </w:abstractNum>
-  <w:abstractNum w:abstractNumId="20" w15:restartNumberingAfterBreak="0">
+  <w:abstractNum w:abstractNumId="21" w15:restartNumberingAfterBreak="0">
     <w:nsid w:val="3E8F2312"/>
     <w:multiLevelType w:val="multilevel"/>
     <w:tmpl w:val="1E6C6F78"/>
@@ -22572,7 +21975,7 @@
       </w:rPr>
     </w:lvl>
   </w:abstractNum>
-  <w:abstractNum w:abstractNumId="21" w15:restartNumberingAfterBreak="0">
+  <w:abstractNum w:abstractNumId="22" w15:restartNumberingAfterBreak="0">
     <w:nsid w:val="48E82A5F"/>
     <w:multiLevelType w:val="multilevel"/>
     <w:tmpl w:val="7808281E"/>
@@ -22721,7 +22124,7 @@
       </w:rPr>
     </w:lvl>
   </w:abstractNum>
-  <w:abstractNum w:abstractNumId="22" w15:restartNumberingAfterBreak="0">
+  <w:abstractNum w:abstractNumId="23" w15:restartNumberingAfterBreak="0">
     <w:nsid w:val="499C2F10"/>
     <w:multiLevelType w:val="multilevel"/>
     <w:tmpl w:val="7E76189C"/>
@@ -22870,7 +22273,7 @@
       </w:rPr>
     </w:lvl>
   </w:abstractNum>
-  <w:abstractNum w:abstractNumId="23" w15:restartNumberingAfterBreak="0">
+  <w:abstractNum w:abstractNumId="24" w15:restartNumberingAfterBreak="0">
     <w:nsid w:val="49AE551E"/>
     <w:multiLevelType w:val="multilevel"/>
     <w:tmpl w:val="59AED176"/>
@@ -23019,7 +22422,7 @@
       </w:rPr>
     </w:lvl>
   </w:abstractNum>
-  <w:abstractNum w:abstractNumId="24" w15:restartNumberingAfterBreak="0">
+  <w:abstractNum w:abstractNumId="25" w15:restartNumberingAfterBreak="0">
     <w:nsid w:val="49CE313F"/>
     <w:multiLevelType w:val="multilevel"/>
     <w:tmpl w:val="1960D48E"/>
@@ -23168,7 +22571,7 @@
       </w:rPr>
     </w:lvl>
   </w:abstractNum>
-  <w:abstractNum w:abstractNumId="25" w15:restartNumberingAfterBreak="0">
+  <w:abstractNum w:abstractNumId="26" w15:restartNumberingAfterBreak="0">
     <w:nsid w:val="52913F29"/>
     <w:multiLevelType w:val="multilevel"/>
     <w:tmpl w:val="9BC09F02"/>
@@ -23317,7 +22720,7 @@
       </w:rPr>
     </w:lvl>
   </w:abstractNum>
-  <w:abstractNum w:abstractNumId="26" w15:restartNumberingAfterBreak="0">
+  <w:abstractNum w:abstractNumId="27" w15:restartNumberingAfterBreak="0">
     <w:nsid w:val="545B6DEA"/>
     <w:multiLevelType w:val="multilevel"/>
     <w:tmpl w:val="100E487C"/>
@@ -23466,7 +22869,7 @@
       </w:rPr>
     </w:lvl>
   </w:abstractNum>
-  <w:abstractNum w:abstractNumId="27" w15:restartNumberingAfterBreak="0">
+  <w:abstractNum w:abstractNumId="28" w15:restartNumberingAfterBreak="0">
     <w:nsid w:val="54976768"/>
     <w:multiLevelType w:val="multilevel"/>
     <w:tmpl w:val="AA586C9C"/>
@@ -23615,7 +23018,7 @@
       </w:rPr>
     </w:lvl>
   </w:abstractNum>
-  <w:abstractNum w:abstractNumId="28" w15:restartNumberingAfterBreak="0">
+  <w:abstractNum w:abstractNumId="29" w15:restartNumberingAfterBreak="0">
     <w:nsid w:val="579C52C8"/>
     <w:multiLevelType w:val="multilevel"/>
     <w:tmpl w:val="1E805A64"/>
@@ -23764,7 +23167,7 @@
       </w:rPr>
     </w:lvl>
   </w:abstractNum>
-  <w:abstractNum w:abstractNumId="29" w15:restartNumberingAfterBreak="0">
+  <w:abstractNum w:abstractNumId="30" w15:restartNumberingAfterBreak="0">
     <w:nsid w:val="58213C29"/>
     <w:multiLevelType w:val="multilevel"/>
     <w:tmpl w:val="5052E23C"/>
@@ -23913,7 +23316,7 @@
       </w:rPr>
     </w:lvl>
   </w:abstractNum>
-  <w:abstractNum w:abstractNumId="30" w15:restartNumberingAfterBreak="0">
+  <w:abstractNum w:abstractNumId="31" w15:restartNumberingAfterBreak="0">
     <w:nsid w:val="585D1FFC"/>
     <w:multiLevelType w:val="multilevel"/>
     <w:tmpl w:val="7A686A1E"/>
@@ -24062,7 +23465,7 @@
       </w:rPr>
     </w:lvl>
   </w:abstractNum>
-  <w:abstractNum w:abstractNumId="31" w15:restartNumberingAfterBreak="0">
+  <w:abstractNum w:abstractNumId="32" w15:restartNumberingAfterBreak="0">
     <w:nsid w:val="593175DF"/>
     <w:multiLevelType w:val="multilevel"/>
     <w:tmpl w:val="7B42127E"/>
@@ -24211,7 +23614,7 @@
       </w:rPr>
     </w:lvl>
   </w:abstractNum>
-  <w:abstractNum w:abstractNumId="32" w15:restartNumberingAfterBreak="0">
+  <w:abstractNum w:abstractNumId="33" w15:restartNumberingAfterBreak="0">
     <w:nsid w:val="5E344E5D"/>
     <w:multiLevelType w:val="multilevel"/>
     <w:tmpl w:val="F8A46BE8"/>
@@ -24360,7 +23763,7 @@
       </w:rPr>
     </w:lvl>
   </w:abstractNum>
-  <w:abstractNum w:abstractNumId="33" w15:restartNumberingAfterBreak="0">
+  <w:abstractNum w:abstractNumId="34" w15:restartNumberingAfterBreak="0">
     <w:nsid w:val="5FF90F03"/>
     <w:multiLevelType w:val="multilevel"/>
     <w:tmpl w:val="3CF60892"/>
@@ -24477,7 +23880,7 @@
       </w:pPr>
     </w:lvl>
   </w:abstractNum>
-  <w:abstractNum w:abstractNumId="34" w15:restartNumberingAfterBreak="0">
+  <w:abstractNum w:abstractNumId="35" w15:restartNumberingAfterBreak="0">
     <w:nsid w:val="618A4700"/>
     <w:multiLevelType w:val="multilevel"/>
     <w:tmpl w:val="3EBE62AA"/>
@@ -24626,7 +24029,7 @@
       </w:rPr>
     </w:lvl>
   </w:abstractNum>
-  <w:abstractNum w:abstractNumId="35" w15:restartNumberingAfterBreak="0">
+  <w:abstractNum w:abstractNumId="36" w15:restartNumberingAfterBreak="0">
     <w:nsid w:val="668E2448"/>
     <w:multiLevelType w:val="multilevel"/>
     <w:tmpl w:val="39060BFE"/>
@@ -24775,7 +24178,7 @@
       </w:rPr>
     </w:lvl>
   </w:abstractNum>
-  <w:abstractNum w:abstractNumId="36" w15:restartNumberingAfterBreak="0">
+  <w:abstractNum w:abstractNumId="37" w15:restartNumberingAfterBreak="0">
     <w:nsid w:val="6AE35D91"/>
     <w:multiLevelType w:val="multilevel"/>
     <w:tmpl w:val="8C2CD95C"/>
@@ -24892,7 +24295,7 @@
       </w:pPr>
     </w:lvl>
   </w:abstractNum>
-  <w:abstractNum w:abstractNumId="37" w15:restartNumberingAfterBreak="0">
+  <w:abstractNum w:abstractNumId="38" w15:restartNumberingAfterBreak="0">
     <w:nsid w:val="6C570E57"/>
     <w:multiLevelType w:val="multilevel"/>
     <w:tmpl w:val="ACE67DD8"/>
@@ -25041,7 +24444,7 @@
       </w:rPr>
     </w:lvl>
   </w:abstractNum>
-  <w:abstractNum w:abstractNumId="38" w15:restartNumberingAfterBreak="0">
+  <w:abstractNum w:abstractNumId="39" w15:restartNumberingAfterBreak="0">
     <w:nsid w:val="6F0017A6"/>
     <w:multiLevelType w:val="multilevel"/>
     <w:tmpl w:val="CE66BD36"/>
@@ -25190,7 +24593,7 @@
       </w:rPr>
     </w:lvl>
   </w:abstractNum>
-  <w:abstractNum w:abstractNumId="39" w15:restartNumberingAfterBreak="0">
+  <w:abstractNum w:abstractNumId="40" w15:restartNumberingAfterBreak="0">
     <w:nsid w:val="6FA5588A"/>
     <w:multiLevelType w:val="multilevel"/>
     <w:tmpl w:val="D894626C"/>
@@ -25339,7 +24742,7 @@
       </w:rPr>
     </w:lvl>
   </w:abstractNum>
-  <w:abstractNum w:abstractNumId="40" w15:restartNumberingAfterBreak="0">
+  <w:abstractNum w:abstractNumId="41" w15:restartNumberingAfterBreak="0">
     <w:nsid w:val="7111571D"/>
     <w:multiLevelType w:val="multilevel"/>
     <w:tmpl w:val="6AE8E5DC"/>
@@ -25488,7 +24891,7 @@
       </w:rPr>
     </w:lvl>
   </w:abstractNum>
-  <w:abstractNum w:abstractNumId="41" w15:restartNumberingAfterBreak="0">
+  <w:abstractNum w:abstractNumId="42" w15:restartNumberingAfterBreak="0">
     <w:nsid w:val="73C102A7"/>
     <w:multiLevelType w:val="multilevel"/>
     <w:tmpl w:val="E3EED726"/>
@@ -25637,7 +25040,7 @@
       </w:rPr>
     </w:lvl>
   </w:abstractNum>
-  <w:abstractNum w:abstractNumId="42" w15:restartNumberingAfterBreak="0">
+  <w:abstractNum w:abstractNumId="43" w15:restartNumberingAfterBreak="0">
     <w:nsid w:val="74B178A0"/>
     <w:multiLevelType w:val="multilevel"/>
     <w:tmpl w:val="D7429F9C"/>
@@ -25786,7 +25189,7 @@
       </w:rPr>
     </w:lvl>
   </w:abstractNum>
-  <w:abstractNum w:abstractNumId="43" w15:restartNumberingAfterBreak="0">
+  <w:abstractNum w:abstractNumId="44" w15:restartNumberingAfterBreak="0">
     <w:nsid w:val="799773B9"/>
     <w:multiLevelType w:val="multilevel"/>
     <w:tmpl w:val="B9FC988C"/>
@@ -25935,7 +25338,7 @@
       </w:rPr>
     </w:lvl>
   </w:abstractNum>
-  <w:abstractNum w:abstractNumId="44" w15:restartNumberingAfterBreak="0">
+  <w:abstractNum w:abstractNumId="45" w15:restartNumberingAfterBreak="0">
     <w:nsid w:val="7A1968B3"/>
     <w:multiLevelType w:val="multilevel"/>
     <w:tmpl w:val="BF00D7CE"/>
@@ -26084,7 +25487,7 @@
       </w:rPr>
     </w:lvl>
   </w:abstractNum>
-  <w:abstractNum w:abstractNumId="45" w15:restartNumberingAfterBreak="0">
+  <w:abstractNum w:abstractNumId="46" w15:restartNumberingAfterBreak="0">
     <w:nsid w:val="7DCA7425"/>
     <w:multiLevelType w:val="multilevel"/>
     <w:tmpl w:val="F1328E70"/>
@@ -26233,7 +25636,7 @@
       </w:rPr>
     </w:lvl>
   </w:abstractNum>
-  <w:abstractNum w:abstractNumId="46" w15:restartNumberingAfterBreak="0">
+  <w:abstractNum w:abstractNumId="47" w15:restartNumberingAfterBreak="0">
     <w:nsid w:val="7F3B57BF"/>
     <w:multiLevelType w:val="multilevel"/>
     <w:tmpl w:val="07FA64D6"/>
@@ -26383,97 +25786,97 @@
     </w:lvl>
   </w:abstractNum>
   <w:num w:numId="1">
-    <w:abstractNumId w:val="13"/>
+    <w:abstractNumId w:val="14"/>
   </w:num>
   <w:num w:numId="2">
     <w:abstractNumId w:val="1"/>
   </w:num>
   <w:num w:numId="3">
-    <w:abstractNumId w:val="30"/>
+    <w:abstractNumId w:val="31"/>
   </w:num>
   <w:num w:numId="4">
-    <w:abstractNumId w:val="20"/>
+    <w:abstractNumId w:val="21"/>
   </w:num>
   <w:num w:numId="5">
-    <w:abstractNumId w:val="24"/>
+    <w:abstractNumId w:val="25"/>
   </w:num>
   <w:num w:numId="6">
-    <w:abstractNumId w:val="37"/>
+    <w:abstractNumId w:val="38"/>
   </w:num>
   <w:num w:numId="7">
     <w:abstractNumId w:val="8"/>
   </w:num>
   <w:num w:numId="8">
-    <w:abstractNumId w:val="17"/>
+    <w:abstractNumId w:val="18"/>
   </w:num>
   <w:num w:numId="9">
-    <w:abstractNumId w:val="46"/>
+    <w:abstractNumId w:val="47"/>
   </w:num>
   <w:num w:numId="10">
-    <w:abstractNumId w:val="40"/>
+    <w:abstractNumId w:val="41"/>
   </w:num>
   <w:num w:numId="11">
-    <w:abstractNumId w:val="31"/>
+    <w:abstractNumId w:val="32"/>
   </w:num>
   <w:num w:numId="12">
-    <w:abstractNumId w:val="41"/>
+    <w:abstractNumId w:val="42"/>
   </w:num>
   <w:num w:numId="13">
-    <w:abstractNumId w:val="15"/>
+    <w:abstractNumId w:val="16"/>
   </w:num>
   <w:num w:numId="14">
-    <w:abstractNumId w:val="25"/>
+    <w:abstractNumId w:val="26"/>
   </w:num>
   <w:num w:numId="15">
     <w:abstractNumId w:val="9"/>
   </w:num>
   <w:num w:numId="16">
-    <w:abstractNumId w:val="43"/>
+    <w:abstractNumId w:val="44"/>
   </w:num>
   <w:num w:numId="17">
     <w:abstractNumId w:val="11"/>
   </w:num>
   <w:num w:numId="18">
-    <w:abstractNumId w:val="28"/>
+    <w:abstractNumId w:val="29"/>
   </w:num>
   <w:num w:numId="19">
     <w:abstractNumId w:val="7"/>
   </w:num>
   <w:num w:numId="20">
-    <w:abstractNumId w:val="22"/>
+    <w:abstractNumId w:val="23"/>
   </w:num>
   <w:num w:numId="21">
-    <w:abstractNumId w:val="26"/>
+    <w:abstractNumId w:val="27"/>
   </w:num>
   <w:num w:numId="22">
-    <w:abstractNumId w:val="14"/>
+    <w:abstractNumId w:val="15"/>
   </w:num>
   <w:num w:numId="23">
-    <w:abstractNumId w:val="29"/>
+    <w:abstractNumId w:val="30"/>
   </w:num>
   <w:num w:numId="24">
-    <w:abstractNumId w:val="36"/>
+    <w:abstractNumId w:val="37"/>
   </w:num>
   <w:num w:numId="25">
     <w:abstractNumId w:val="10"/>
   </w:num>
   <w:num w:numId="26">
-    <w:abstractNumId w:val="32"/>
+    <w:abstractNumId w:val="33"/>
   </w:num>
   <w:num w:numId="27">
-    <w:abstractNumId w:val="42"/>
+    <w:abstractNumId w:val="43"/>
   </w:num>
   <w:num w:numId="28">
-    <w:abstractNumId w:val="35"/>
+    <w:abstractNumId w:val="36"/>
   </w:num>
   <w:num w:numId="29">
-    <w:abstractNumId w:val="21"/>
+    <w:abstractNumId w:val="22"/>
   </w:num>
   <w:num w:numId="30">
-    <w:abstractNumId w:val="16"/>
+    <w:abstractNumId w:val="17"/>
   </w:num>
   <w:num w:numId="31">
-    <w:abstractNumId w:val="39"/>
+    <w:abstractNumId w:val="40"/>
   </w:num>
   <w:num w:numId="32">
     <w:abstractNumId w:val="3"/>
@@ -26485,19 +25888,19 @@
     <w:abstractNumId w:val="12"/>
   </w:num>
   <w:num w:numId="35">
-    <w:abstractNumId w:val="33"/>
+    <w:abstractNumId w:val="34"/>
   </w:num>
   <w:num w:numId="36">
     <w:abstractNumId w:val="5"/>
   </w:num>
   <w:num w:numId="37">
-    <w:abstractNumId w:val="19"/>
+    <w:abstractNumId w:val="20"/>
   </w:num>
   <w:num w:numId="38">
-    <w:abstractNumId w:val="27"/>
+    <w:abstractNumId w:val="28"/>
   </w:num>
   <w:num w:numId="39">
-    <w:abstractNumId w:val="44"/>
+    <w:abstractNumId w:val="45"/>
   </w:num>
   <w:num w:numId="40">
     <w:abstractNumId w:val="2"/>
@@ -26506,22 +25909,25 @@
     <w:abstractNumId w:val="6"/>
   </w:num>
   <w:num w:numId="42">
-    <w:abstractNumId w:val="34"/>
+    <w:abstractNumId w:val="35"/>
   </w:num>
   <w:num w:numId="43">
-    <w:abstractNumId w:val="23"/>
+    <w:abstractNumId w:val="24"/>
   </w:num>
   <w:num w:numId="44">
     <w:abstractNumId w:val="4"/>
   </w:num>
   <w:num w:numId="45">
-    <w:abstractNumId w:val="45"/>
+    <w:abstractNumId w:val="46"/>
   </w:num>
   <w:num w:numId="46">
-    <w:abstractNumId w:val="38"/>
+    <w:abstractNumId w:val="39"/>
   </w:num>
   <w:num w:numId="47">
-    <w:abstractNumId w:val="18"/>
+    <w:abstractNumId w:val="19"/>
+  </w:num>
+  <w:num w:numId="48">
+    <w:abstractNumId w:val="13"/>
   </w:num>
 </w:numbering>
 </file>

</xml_diff>